<commit_message>
Fix title in docs for regulatory identifiers
</commit_message>
<xml_diff>
--- a/tests/test_files/m11/LZZT/LZZT.docx
+++ b/tests/test_files/m11/LZZT/LZZT.docx
@@ -1,6 +1,6 @@
 
 <file path=word/document.xml><?xml version="1.0" encoding="utf-8"?>
-<w:document xmlns:wpc="http://schemas.microsoft.com/office/word/2010/wordprocessingCanvas" xmlns:cx="http://schemas.microsoft.com/office/drawing/2014/chartex" xmlns:cx1="http://schemas.microsoft.com/office/drawing/2015/9/8/chartex" xmlns:cx2="http://schemas.microsoft.com/office/drawing/2015/10/21/chartex" xmlns:cx3="http://schemas.microsoft.com/office/drawing/2016/5/9/chartex" xmlns:cx4="http://schemas.microsoft.com/office/drawing/2016/5/10/chartex" xmlns:cx5="http://schemas.microsoft.com/office/drawing/2016/5/11/chartex" xmlns:cx6="http://schemas.microsoft.com/office/drawing/2016/5/12/chartex" xmlns:cx7="http://schemas.microsoft.com/office/drawing/2016/5/13/chartex" xmlns:cx8="http://schemas.microsoft.com/office/drawing/2016/5/14/chartex" xmlns:mc="http://schemas.openxmlformats.org/markup-compatibility/2006" xmlns:aink="http://schemas.microsoft.com/office/drawing/2016/ink" xmlns:am3d="http://schemas.microsoft.com/office/drawing/2017/model3d" xmlns:o="urn:schemas-microsoft-com:office:office" xmlns:oel="http://schemas.microsoft.com/office/2019/extlst" xmlns:r="http://schemas.openxmlformats.org/officeDocument/2006/relationships" xmlns:m="http://schemas.openxmlformats.org/officeDocument/2006/math" xmlns:v="urn:schemas-microsoft-com:vml" xmlns:wp14="http://schemas.microsoft.com/office/word/2010/wordprocessingDrawing" xmlns:wp="http://schemas.openxmlformats.org/drawingml/2006/wordprocessingDrawing" xmlns:w10="urn:schemas-microsoft-com:office:word" xmlns:w="http://schemas.openxmlformats.org/wordprocessingml/2006/main" xmlns:w14="http://schemas.microsoft.com/office/word/2010/wordml" xmlns:w15="http://schemas.microsoft.com/office/word/2012/wordml" xmlns:w16cex="http://schemas.microsoft.com/office/word/2018/wordml/cex" xmlns:w16cid="http://schemas.microsoft.com/office/word/2016/wordml/cid" xmlns:w16="http://schemas.microsoft.com/office/word/2018/wordml" xmlns:w16du="http://schemas.microsoft.com/office/word/2023/wordml/word16du" xmlns:w16sdtdh="http://schemas.microsoft.com/office/word/2020/wordml/sdtdatahash" xmlns:w16se="http://schemas.microsoft.com/office/word/2015/wordml/symex" xmlns:wpg="http://schemas.microsoft.com/office/word/2010/wordprocessingGroup" xmlns:wpi="http://schemas.microsoft.com/office/word/2010/wordprocessingInk" xmlns:wne="http://schemas.microsoft.com/office/word/2006/wordml" xmlns:wps="http://schemas.microsoft.com/office/word/2010/wordprocessingShape" mc:Ignorable="w14 w15 w16se w16cid w16 w16cex w16sdtdh w16du wp14">
+<w:document xmlns:wpc="http://schemas.microsoft.com/office/word/2010/wordprocessingCanvas" xmlns:cx="http://schemas.microsoft.com/office/drawing/2014/chartex" xmlns:cx1="http://schemas.microsoft.com/office/drawing/2015/9/8/chartex" xmlns:cx2="http://schemas.microsoft.com/office/drawing/2015/10/21/chartex" xmlns:cx3="http://schemas.microsoft.com/office/drawing/2016/5/9/chartex" xmlns:cx4="http://schemas.microsoft.com/office/drawing/2016/5/10/chartex" xmlns:cx5="http://schemas.microsoft.com/office/drawing/2016/5/11/chartex" xmlns:cx6="http://schemas.microsoft.com/office/drawing/2016/5/12/chartex" xmlns:cx7="http://schemas.microsoft.com/office/drawing/2016/5/13/chartex" xmlns:cx8="http://schemas.microsoft.com/office/drawing/2016/5/14/chartex" xmlns:mc="http://schemas.openxmlformats.org/markup-compatibility/2006" xmlns:aink="http://schemas.microsoft.com/office/drawing/2016/ink" xmlns:am3d="http://schemas.microsoft.com/office/drawing/2017/model3d" xmlns:o="urn:schemas-microsoft-com:office:office" xmlns:oel="http://schemas.microsoft.com/office/2019/extlst" xmlns:r="http://schemas.openxmlformats.org/officeDocument/2006/relationships" xmlns:m="http://schemas.openxmlformats.org/officeDocument/2006/math" xmlns:v="urn:schemas-microsoft-com:vml" xmlns:wp14="http://schemas.microsoft.com/office/word/2010/wordprocessingDrawing" xmlns:wp="http://schemas.openxmlformats.org/drawingml/2006/wordprocessingDrawing" xmlns:w10="urn:schemas-microsoft-com:office:word" xmlns:w="http://schemas.openxmlformats.org/wordprocessingml/2006/main" xmlns:w14="http://schemas.microsoft.com/office/word/2010/wordml" xmlns:w15="http://schemas.microsoft.com/office/word/2012/wordml" xmlns:w16cex="http://schemas.microsoft.com/office/word/2018/wordml/cex" xmlns:w16cid="http://schemas.microsoft.com/office/word/2016/wordml/cid" xmlns:w16="http://schemas.microsoft.com/office/word/2018/wordml" xmlns:w16du="http://schemas.microsoft.com/office/word/2023/wordml/word16du" xmlns:w16sdtdh="http://schemas.microsoft.com/office/word/2020/wordml/sdtdatahash" xmlns:w16sdtfl="http://schemas.microsoft.com/office/word/2024/wordml/sdtformatlock" xmlns:w16se="http://schemas.microsoft.com/office/word/2015/wordml/symex" xmlns:wpg="http://schemas.microsoft.com/office/word/2010/wordprocessingGroup" xmlns:wpi="http://schemas.microsoft.com/office/word/2010/wordprocessingInk" xmlns:wne="http://schemas.microsoft.com/office/word/2006/wordml" xmlns:wps="http://schemas.microsoft.com/office/word/2010/wordprocessingShape" mc:Ignorable="w14 w15 w16se w16cid w16 w16cex w16sdtdh w16sdtfl w16du wp14">
   <w:body>
     <w:p>
       <w:pPr>
@@ -1136,8 +1136,6 @@
               <w:spacing w:after="80"/>
               <w:rPr>
                 <w:rFonts w:cs="Times New Roman"/>
-                <w:b/>
-                <w:bCs/>
               </w:rPr>
             </w:pPr>
             <w:r>
@@ -1146,16 +1144,24 @@
                 <w:b/>
                 <w:bCs/>
               </w:rPr>
-              <w:t>Regulatory Agency Identifier Number(s):</w:t>
-            </w:r>
-          </w:p>
-          <w:p>
-            <w:pPr>
-              <w:spacing w:after="80"/>
+              <w:t xml:space="preserve">Regulatory </w:t>
+            </w:r>
+            <w:r>
               <w:rPr>
                 <w:rFonts w:cs="Times New Roman"/>
-              </w:rPr>
-            </w:pPr>
+                <w:b/>
+                <w:bCs/>
+              </w:rPr>
+              <w:t xml:space="preserve">or Clinical Trial </w:t>
+            </w:r>
+            <w:r>
+              <w:rPr>
+                <w:rFonts w:cs="Times New Roman"/>
+                <w:b/>
+                <w:bCs/>
+              </w:rPr>
+              <w:t>Identifier(s):</w:t>
+            </w:r>
           </w:p>
         </w:tc>
         <w:tc>
@@ -2425,7 +2431,6 @@
         <w:tc>
           <w:tcPr>
             <w:tcW w:w="2875" w:type="dxa"/>
-            <w:shd w:val="clear" w:color="auto" w:fill="auto"/>
           </w:tcPr>
           <w:p>
             <w:pPr>
@@ -2463,7 +2468,6 @@
         <w:tc>
           <w:tcPr>
             <w:tcW w:w="4230" w:type="dxa"/>
-            <w:shd w:val="clear" w:color="auto" w:fill="auto"/>
           </w:tcPr>
           <w:p>
             <w:pPr>
@@ -2505,7 +2509,6 @@
         <w:tc>
           <w:tcPr>
             <w:tcW w:w="2069" w:type="dxa"/>
-            <w:shd w:val="clear" w:color="auto" w:fill="auto"/>
           </w:tcPr>
           <w:p>
             <w:pPr>
@@ -16274,7 +16277,6 @@
               <w:bottom w:val="single" w:sz="6" w:space="0" w:color="4F81BD"/>
               <w:right w:val="nil"/>
             </w:tcBorders>
-            <w:shd w:val="clear" w:color="auto" w:fill="auto"/>
             <w:vAlign w:val="center"/>
             <w:hideMark/>
           </w:tcPr>
@@ -16304,7 +16306,6 @@
               <w:bottom w:val="single" w:sz="6" w:space="0" w:color="4F81BD"/>
               <w:right w:val="single" w:sz="6" w:space="0" w:color="auto"/>
             </w:tcBorders>
-            <w:shd w:val="clear" w:color="auto" w:fill="auto"/>
             <w:vAlign w:val="center"/>
             <w:hideMark/>
           </w:tcPr>
@@ -16795,6 +16796,7 @@
       <w:bookmarkEnd w:id="28"/>
       <w:bookmarkEnd w:id="29"/>
       <w:r>
+        <w:lastRenderedPageBreak/>
         <w:t xml:space="preserve">Rationale </w:t>
       </w:r>
       <w:r>
@@ -16863,7 +16865,6 @@
           <w:rFonts w:ascii="Times New Roman" w:hAnsi="Times New Roman"/>
           <w:color w:val="auto"/>
         </w:rPr>
-        <w:lastRenderedPageBreak/>
         <w:t>Approximately 100 patients will be randomized to each of the 3 treatment groups. Previous experience with the oral formulation of xanomeline suggests that this sample size has 90% power to detect a 3.0 mean treatment difference in ADAS-Cog (p</w:t>
       </w:r>
       <w:r>
@@ -17093,7 +17094,11 @@
         <w:t>screening</w:t>
       </w:r>
       <w:r>
-        <w:t xml:space="preserve"> will include asking the candidate preliminary questions (such as age and general health status) and conducting invasive or diagnostic procedures and/or tests (for example, diagnostic psychological tests, x-rays, blood draws). Patients will sign the consent at Xanomeline (LY246708) H2Q-MC-LZZT(c) Copyright © 2006 Eli Lilly and Company Clinical Study Protocol Document Page 11 their screening visit, thereby consenting to undergo the screening procedures and to participate in the study if they qualify. </w:t>
+        <w:t xml:space="preserve"> will include asking the candidate preliminary questions (such as age and general health status) and conducting invasive or diagnostic procedures and/or tests (for example, diagnostic psychological tests, x-rays, blood draws). Patients will sign the consent at Xanomeline (LY246708) H2Q-MC-LZZT(c) Copyright © 2006 Eli Lilly and Company Clinical Study Protocol Document Page 11 their screening visit, thereby </w:t>
+      </w:r>
+      <w:r>
+        <w:lastRenderedPageBreak/>
+        <w:t xml:space="preserve">consenting to undergo the screening procedures and to participate in the study if they qualify. </w:t>
       </w:r>
     </w:p>
     <w:p>
@@ -17245,7 +17250,6 @@
       </w:pPr>
       <w:bookmarkStart w:id="36" w:name="_Toc163664301"/>
       <w:r>
-        <w:lastRenderedPageBreak/>
         <w:t>Access to Trial Intervention After End of Trial</w:t>
       </w:r>
       <w:bookmarkEnd w:id="36"/>
@@ -17667,7 +17671,6 @@
           <w:sz w:val="24"/>
           <w:szCs w:val="24"/>
         </w:rPr>
-        <w:lastRenderedPageBreak/>
         <w:t xml:space="preserve">Large, confluent areas of encephalomalacia in parieto-occipital or frontal regions consistent with watershed infarcts. </w:t>
       </w:r>
     </w:p>
@@ -17903,6 +17906,7 @@
         <w:pStyle w:val="InstructionalTExt"/>
       </w:pPr>
       <w:r>
+        <w:lastRenderedPageBreak/>
         <w:t xml:space="preserve"> </w:t>
       </w:r>
     </w:p>
@@ -18091,7 +18095,6 @@
           <w:sz w:val="24"/>
           <w:szCs w:val="24"/>
         </w:rPr>
-        <w:lastRenderedPageBreak/>
         <w:t xml:space="preserve">Multiple sclerosis </w:t>
       </w:r>
     </w:p>
@@ -18612,6 +18615,7 @@
           <w:sz w:val="24"/>
           <w:szCs w:val="24"/>
         </w:rPr>
+        <w:lastRenderedPageBreak/>
         <w:t xml:space="preserve">Pancreatitis </w:t>
       </w:r>
     </w:p>
@@ -18916,7 +18920,6 @@
           <w:sz w:val="24"/>
           <w:szCs w:val="24"/>
         </w:rPr>
-        <w:lastRenderedPageBreak/>
         <w:t xml:space="preserve">Lupus </w:t>
       </w:r>
     </w:p>
@@ -19227,6 +19230,7 @@
           <w:sz w:val="24"/>
           <w:szCs w:val="24"/>
         </w:rPr>
+        <w:lastRenderedPageBreak/>
         <w:t xml:space="preserve">Vitamin B12 reference range 130 to 900 pg/mL. Patients will be allowed to enroll if their B12 levels are above the upper reference range if patients are taking oral vitamin supplements. </w:t>
       </w:r>
     </w:p>
@@ -19335,7 +19339,6 @@
           <w:sz w:val="24"/>
           <w:szCs w:val="24"/>
         </w:rPr>
-        <w:lastRenderedPageBreak/>
         <w:t xml:space="preserve">Positive syphilis screening. Positive syphilis screening. As determined by positive RPR followed up by confirmatory FTA-Abs. Confirmed patients are excluded unless there is a documented medical history of an alternative disease (for example, yaws) which caused the lab abnormality. </w:t>
       </w:r>
     </w:p>
@@ -20123,6 +20126,7 @@
           <w:sz w:val="24"/>
           <w:szCs w:val="24"/>
         </w:rPr>
+        <w:lastRenderedPageBreak/>
         <w:t xml:space="preserve">The use of low doses (2 mg daily) of either Hytrin® or Cardura® for relief of urinary retention for patients with prostatic hypertrophy will be considered on a case-by-case basis provided blood pressure is stable and the medication has not had demonstrable effect on dementia symptoms in the opinion of the treating physician. Contact CRO medical monitor. </w:t>
       </w:r>
     </w:p>
@@ -20421,7 +20425,6 @@
           <w:sz w:val="24"/>
           <w:szCs w:val="24"/>
         </w:rPr>
-        <w:lastRenderedPageBreak/>
         <w:t xml:space="preserve">Beta blockers including but not limited to </w:t>
       </w:r>
     </w:p>
@@ -21518,6 +21521,7 @@
           <w:sz w:val="24"/>
           <w:szCs w:val="24"/>
         </w:rPr>
+        <w:lastRenderedPageBreak/>
         <w:t xml:space="preserve">Cholinergic eye drops for treatment of glaucoma will be allowed during the study on a case-by-case basis. Please contact the CRO medical monitor. </w:t>
       </w:r>
     </w:p>
@@ -22265,7 +22269,6 @@
           <w:sz w:val="24"/>
           <w:szCs w:val="24"/>
         </w:rPr>
-        <w:lastRenderedPageBreak/>
         <w:t xml:space="preserve">Artane® (trihexyphenidyl) </w:t>
       </w:r>
       <w:r>
@@ -23897,6 +23900,7 @@
           <w:sz w:val="24"/>
           <w:szCs w:val="24"/>
         </w:rPr>
+        <w:lastRenderedPageBreak/>
         <w:t xml:space="preserve">Remeron® (mirtazapine) </w:t>
       </w:r>
       <w:r>
@@ -25162,7 +25166,6 @@
           <w:sz w:val="24"/>
           <w:szCs w:val="24"/>
         </w:rPr>
-        <w:lastRenderedPageBreak/>
         <w:t xml:space="preserve">Tagamet® (cimetidine) </w:t>
       </w:r>
       <w:r>
@@ -26262,6 +26265,7 @@
           <w:sz w:val="24"/>
           <w:szCs w:val="24"/>
         </w:rPr>
+        <w:lastRenderedPageBreak/>
         <w:t xml:space="preserve">Haldol® (haloperidol) </w:t>
       </w:r>
       <w:r>
@@ -27169,7 +27173,6 @@
           <w:sz w:val="24"/>
           <w:szCs w:val="24"/>
         </w:rPr>
-        <w:lastRenderedPageBreak/>
         <w:t xml:space="preserve">BuSpar® (buspirone) </w:t>
       </w:r>
       <w:r>
@@ -28322,6 +28325,7 @@
           <w:sz w:val="24"/>
           <w:szCs w:val="24"/>
         </w:rPr>
+        <w:lastRenderedPageBreak/>
         <w:t xml:space="preserve">Histamine (H1) antagonists including but not limited to </w:t>
       </w:r>
     </w:p>
@@ -29209,7 +29213,6 @@
           <w:sz w:val="24"/>
           <w:szCs w:val="24"/>
         </w:rPr>
-        <w:lastRenderedPageBreak/>
         <w:t xml:space="preserve">Cylert® (pemoline) </w:t>
       </w:r>
       <w:r>
@@ -30047,6 +30050,7 @@
           <w:sz w:val="24"/>
           <w:szCs w:val="24"/>
         </w:rPr>
+        <w:lastRenderedPageBreak/>
         <w:t>v) Estrogen supplements are permitted during the study, but dosage</w:t>
       </w:r>
       <w:r>
@@ -30193,11 +30197,7 @@
         <w:pStyle w:val="00Paragraph"/>
       </w:pPr>
       <w:r>
-        <w:t xml:space="preserve">The criteria for enrollment must be followed explicitly. If there is inadvertent enrollment of individuals who do not meet enrollment criteria, these individuals should be discontinued from the study. Such individuals can remain in the study only if there are ethical reasons to have them continue. In these cases, the investigator must obtain approval from the Lilly research physician </w:t>
-      </w:r>
-      <w:r>
-        <w:lastRenderedPageBreak/>
-        <w:t>for the study participant to continue in the study (even if the study is being conducted through a contract research organization).</w:t>
+        <w:t>The criteria for enrollment must be followed explicitly. If there is inadvertent enrollment of individuals who do not meet enrollment criteria, these individuals should be discontinued from the study. Such individuals can remain in the study only if there are ethical reasons to have them continue. In these cases, the investigator must obtain approval from the Lilly research physician for the study participant to continue in the study (even if the study is being conducted through a contract research organization).</w:t>
       </w:r>
     </w:p>
     <w:p>
@@ -34097,6 +34097,7 @@
         </w:numPr>
       </w:pPr>
       <w:r>
+        <w:lastRenderedPageBreak/>
         <w:t>[specify event] – see Section [X] for definition</w:t>
       </w:r>
     </w:p>
@@ -34149,7 +34150,6 @@
       </w:pPr>
       <w:bookmarkStart w:id="127" w:name="_Toc163664357"/>
       <w:r>
-        <w:lastRenderedPageBreak/>
         <w:t>Timing and</w:t>
       </w:r>
       <w:r>
@@ -34465,6 +34465,7 @@
       </w:pPr>
       <w:bookmarkStart w:id="134" w:name="_Toc163664364"/>
       <w:r>
+        <w:lastRenderedPageBreak/>
         <w:t>Regulatory Reporting Requirements</w:t>
       </w:r>
       <w:bookmarkEnd w:id="134"/>
@@ -34513,7 +34514,6 @@
       </w:pPr>
       <w:bookmarkStart w:id="136" w:name="_Toc163664366"/>
       <w:r>
-        <w:lastRenderedPageBreak/>
         <w:t>Disease-related Events or Outcomes Not Qualifying as AEs or SAEs</w:t>
       </w:r>
       <w:bookmarkEnd w:id="136"/>
@@ -34698,6 +34698,7 @@
         <w:pStyle w:val="00Paragraph"/>
       </w:pPr>
       <w:r>
+        <w:lastRenderedPageBreak/>
         <w:t xml:space="preserve">Group mean changes from baseline in the primary efficacy parameters will serve as efficacy criteria. The ADAS-Cog (11) and the video-referenced CIBIC+ will serve as the primary efficacy instruments. Secondary efficacy instruments will include the DAD, the NPI-X, and the ADAS-Cog (14). The procedures and types of analyses to be done are outlined in Section 4. </w:t>
       </w:r>
     </w:p>
@@ -34706,7 +34707,6 @@
         <w:pStyle w:val="00Paragraph"/>
       </w:pPr>
       <w:r>
-        <w:lastRenderedPageBreak/>
         <w:t>The primary analysis of efficacy will include only the data obtained up to and including the visit of discontinuation of study drug. Furthermore, the primary analysis will not include efficacy data obtained at any visit where the study drug was not administered in the preceding</w:t>
       </w:r>
     </w:p>
@@ -34785,6 +34785,7 @@
       </w:pPr>
       <w:bookmarkStart w:id="146" w:name="_Toc163664375"/>
       <w:r>
+        <w:lastRenderedPageBreak/>
         <w:t>Handling of Missing Data</w:t>
       </w:r>
       <w:bookmarkEnd w:id="146"/>
@@ -34811,7 +34812,6 @@
       </w:pPr>
       <w:bookmarkStart w:id="147" w:name="_Toc163664376"/>
       <w:r>
-        <w:lastRenderedPageBreak/>
         <w:t>Times of Analyses</w:t>
       </w:r>
       <w:r>
@@ -34930,6 +34930,7 @@
         <w:pStyle w:val="00Paragraph"/>
       </w:pPr>
       <w:r>
+        <w:lastRenderedPageBreak/>
         <w:t xml:space="preserve">Analysis of the secondary efficacy variables will also be ANCOVA. Pairwise treatment comparisons of the adjusted means for all efficacy variables will be conducted using a LSMEANS statement within the GLM procedure. </w:t>
       </w:r>
     </w:p>
@@ -34938,7 +34939,6 @@
         <w:pStyle w:val="00Paragraph"/>
       </w:pPr>
       <w:r>
-        <w:lastRenderedPageBreak/>
         <w:t xml:space="preserve">Investigator-by-treatment interaction will be tested in a full ANCOVA or ANOVA model, which takes the models described above, and adds the interaction term to the model. Interaction will be tested at α = .10 level. When the interaction is significant at this level, the data will be examined for each individual investigator to attempt to identify the source of the significant interaction. When the interaction is not significant, this term will be dropped from the model as described above, to test for investigator and treatment main effects. By doing so, all ANCOVA and ANOVA models will be able to validly test for treatment differences without weighting each investigator equally, which is what occurs when using Type III sums of squares (cell means model) with the interaction term </w:t>
       </w:r>
       <w:r>
@@ -35003,6 +35003,7 @@
         <w:pStyle w:val="00Paragraph"/>
       </w:pPr>
       <w:r>
+        <w:lastRenderedPageBreak/>
         <w:t xml:space="preserve">The statistical hypothesis that is tested needs to be consistent with the ultimate data-based decision that is reached. When conducting placebo-controlled trials, it is imperative that the drug be demonstrated to be superior in efficacy to placebo, since equivalent or worse efficacy than placebo will preclude approvability. Consequently, a one-sided test for efficacy is required. </w:t>
       </w:r>
     </w:p>
@@ -35011,7 +35012,6 @@
         <w:pStyle w:val="00Paragraph"/>
       </w:pPr>
       <w:r>
-        <w:lastRenderedPageBreak/>
         <w:t xml:space="preserve">The null hypothesis is that the drug is equal or worse than placebo. The alternative hypothesis is that the drug has greater efficacy than placebo. A Type I error occurs only when it is concluded that a study drug is effective when in fact it is not. This can occur in only one tail of the distribution of the treatment difference. Further details of the arguments for one-sided tests in placebo-controlled trials are available in statistical publications (Fisher 1991; Koch 1991; Overall 1991; and Peace 1991). </w:t>
       </w:r>
     </w:p>
@@ -35086,6 +35086,7 @@
         <w:pStyle w:val="00Paragraph"/>
       </w:pPr>
       <w:r>
+        <w:lastRenderedPageBreak/>
         <w:t xml:space="preserve">We expect these two outcome measures to be correlated. From the first large-scale efficacy study of oral xanomeline, Study MC-H2Q-LZZA, the correlation between CIBIC+ and the change in ADAS-Cog(11) from baseline was .252. Consequently, we </w:t>
       </w:r>
       <w:r>
@@ -35098,11 +35099,7 @@
         <w:t>-</w:t>
       </w:r>
       <w:r>
-        <w:t xml:space="preserve">values into a single test, which will then be at </w:t>
-      </w:r>
-      <w:r>
-        <w:lastRenderedPageBreak/>
-        <w:t xml:space="preserve">the .05 Type I error level. Because there will be roughly 300!/(3 * 100!) possible permutations of the data, random data permutations will be sampled (10,000 random permutations). </w:t>
+        <w:t xml:space="preserve">values into a single test, which will then be at the .05 Type I error level. Because there will be roughly 300!/(3 * 100!) possible permutations of the data, random data permutations will be sampled (10,000 random permutations). </w:t>
       </w:r>
     </w:p>
     <w:p>
@@ -35297,11 +35294,8 @@
         <w:pStyle w:val="00Paragraph"/>
       </w:pPr>
       <w:r>
-        <w:t xml:space="preserve">Several outcome measures will be extracted and analyzed from the Ambulatory ECG tapes, including number of pauses, QT interval, and AV block (first, second, or third degree). The primary consideration will be the frequency of pauses. The number of pauses greater than or equal to 2, 3, 4, 5 and 6 seconds will be tabulated. Primary analysis will focus on the number of </w:t>
-      </w:r>
-      <w:r>
         <w:lastRenderedPageBreak/>
-        <w:t xml:space="preserve">pauses greater than or equal to 3 seconds. Due to possible outliers, these data will be analyzed as the laboratory data, by ANOVA on the ranks. </w:t>
+        <w:t xml:space="preserve">Several outcome measures will be extracted and analyzed from the Ambulatory ECG tapes, including number of pauses, QT interval, and AV block (first, second, or third degree). The primary consideration will be the frequency of pauses. The number of pauses greater than or equal to 2, 3, 4, 5 and 6 seconds will be tabulated. Primary analysis will focus on the number of pauses greater than or equal to 3 seconds. Due to possible outliers, these data will be analyzed as the laboratory data, by ANOVA on the ranks. </w:t>
       </w:r>
     </w:p>
     <w:p>
@@ -35401,7 +35395,11 @@
         <w:pStyle w:val="00Paragraph"/>
       </w:pPr>
       <w:r>
-        <w:t xml:space="preserve">Two interim efficacy analyses are planned. The first interim analysis will occur when approximately 50% of the patients have completed 8 weeks; the second interim analysis is to be conducted when approximately 50% of the patients have completed 24 weeks of the study. The purpose of these interim analyses is to provide a rationale for the initiation of subsequent studies of xanomeline TTS, or if the outcome is negative to stop development of xanomeline TTS. The method developed by Enas and Offen (1993) will be used as a guideline as to whether or not to stop one treatment arm, or the study, to declare ineffectiveness. The outcome of the interim analyses will not affect in any way the conduct, results, or analysis of the current study, unless the results are so negative that they lead to a decision to terminate further development of xanomeline TTS in AD. Hence, adjustments to final computed p-values are not appropriate. </w:t>
+        <w:t xml:space="preserve">Two interim efficacy analyses are planned. The first interim analysis will occur when approximately 50% of the patients have completed 8 weeks; the second interim analysis is to be conducted when approximately 50% of the patients have completed 24 weeks of the study. The purpose of these interim analyses is to provide a rationale for the initiation of subsequent studies of xanomeline TTS, or if the outcome is negative to stop development of xanomeline TTS. The method developed by Enas and Offen (1993) will be used as a guideline as to whether or not to stop one treatment arm, or the study, to declare ineffectiveness. The outcome of the interim analyses will not affect in any way the conduct, results, or analysis of the current study, unless </w:t>
+      </w:r>
+      <w:r>
+        <w:lastRenderedPageBreak/>
+        <w:t xml:space="preserve">the results are so negative that they lead to a decision to terminate further development of xanomeline TTS in AD. Hence, adjustments to final computed p-values are not appropriate. </w:t>
       </w:r>
     </w:p>
     <w:p>
@@ -35409,11 +35407,7 @@
         <w:pStyle w:val="00Paragraph"/>
       </w:pPr>
       <w:r>
-        <w:t xml:space="preserve">Planned interim analyses, and any unplanned interim analyses, will be conducted under the auspices of the data monitoring board assigned to this study. Only the data monitoring board is </w:t>
-      </w:r>
-      <w:r>
-        <w:lastRenderedPageBreak/>
-        <w:t xml:space="preserve">authorized to review completely unblinded interim efficacy and safety analyses and, if necessary, to disseminate those results. The data monitoring board will disseminate interim results only if absolutely necessary. Any such dissemination will be documented and described in the final study report. Study sites will not receive information about interim results unless they need to know for the safety of their patients. </w:t>
+        <w:t xml:space="preserve">Planned interim analyses, and any unplanned interim analyses, will be conducted under the auspices of the data monitoring board assigned to this study. Only the data monitoring board is authorized to review completely unblinded interim efficacy and safety analyses and, if necessary, to disseminate those results. The data monitoring board will disseminate interim results only if absolutely necessary. Any such dissemination will be documented and described in the final study report. Study sites will not receive information about interim results unless they need to know for the safety of their patients. </w:t>
       </w:r>
     </w:p>
     <w:p>
@@ -35570,6 +35564,7 @@
         <w:pStyle w:val="00Paragraph"/>
       </w:pPr>
       <w:r>
+        <w:lastRenderedPageBreak/>
         <w:t xml:space="preserve">The investigator must provide the following documentation: </w:t>
       </w:r>
     </w:p>
@@ -35597,7 +35592,6 @@
         </w:rPr>
       </w:pPr>
       <w:r>
-        <w:lastRenderedPageBreak/>
         <w:t>The ethical review board’s approvals of any revisions to the informed consent document or amendments to the protocol.</w:t>
       </w:r>
     </w:p>
@@ -35700,7 +35694,11 @@
         </w:numPr>
       </w:pPr>
       <w:r>
-        <w:t xml:space="preserve">“I hereby give permission for the doctors in charge of this study to release the information regarding, or obtained as a result of, my participation in this study to Lilly, including its agents and contractors; the US Food and Drug Administration (FDA) and other governmental agencies; and to allow them to inspect all my medical records. I understand that medical records that reveal my identity will remain confidential, except that they will be provided as noted above or as may be required by law.” </w:t>
+        <w:t xml:space="preserve">“I hereby give permission for the doctors in charge of this study to release the information regarding, or obtained as a result of, my participation in this study to Lilly, including its agents and contractors; the US Food and Drug Administration (FDA) and other governmental agencies; </w:t>
+      </w:r>
+      <w:r>
+        <w:lastRenderedPageBreak/>
+        <w:t xml:space="preserve">and to allow them to inspect all my medical records. I understand that medical records that reveal my identity will remain confidential, except that they will be provided as noted above or as may be required by law.” </w:t>
       </w:r>
     </w:p>
     <w:p>
@@ -35712,7 +35710,6 @@
         </w:numPr>
       </w:pPr>
       <w:r>
-        <w:lastRenderedPageBreak/>
         <w:t xml:space="preserve">“If I follow the directions of the doctors in charge of this study and I am physically injured because of any substance or procedure properly given me under the plan for this study, Lilly will pay the medical expenses for the treatment of that injury which are not covered by my own insurance, by a government program, or by any other third party. No other compensation is available from Lilly if any injury occurs.” </w:t>
       </w:r>
     </w:p>
@@ -35927,6 +35924,7 @@
         <w:pStyle w:val="00Paragraph"/>
       </w:pPr>
       <w:r>
+        <w:lastRenderedPageBreak/>
         <w:t>To ensure the safety of participants in the study and to ensure accurate, complete, and reliable data, the investigator will do the following</w:t>
       </w:r>
       <w:r>
@@ -35942,7 +35940,6 @@
         </w:numPr>
       </w:pPr>
       <w:r>
-        <w:lastRenderedPageBreak/>
         <w:t xml:space="preserve">Keep records of laboratory tests, clinical notes, and patient medical records in the patient files as original source documents for the study. </w:t>
       </w:r>
     </w:p>
@@ -36370,7 +36367,7 @@
 </file>
 
 <file path=word/endnotes.xml><?xml version="1.0" encoding="utf-8"?>
-<w:endnotes xmlns:wpc="http://schemas.microsoft.com/office/word/2010/wordprocessingCanvas" xmlns:cx="http://schemas.microsoft.com/office/drawing/2014/chartex" xmlns:cx1="http://schemas.microsoft.com/office/drawing/2015/9/8/chartex" xmlns:cx2="http://schemas.microsoft.com/office/drawing/2015/10/21/chartex" xmlns:cx3="http://schemas.microsoft.com/office/drawing/2016/5/9/chartex" xmlns:cx4="http://schemas.microsoft.com/office/drawing/2016/5/10/chartex" xmlns:cx5="http://schemas.microsoft.com/office/drawing/2016/5/11/chartex" xmlns:cx6="http://schemas.microsoft.com/office/drawing/2016/5/12/chartex" xmlns:cx7="http://schemas.microsoft.com/office/drawing/2016/5/13/chartex" xmlns:cx8="http://schemas.microsoft.com/office/drawing/2016/5/14/chartex" xmlns:mc="http://schemas.openxmlformats.org/markup-compatibility/2006" xmlns:aink="http://schemas.microsoft.com/office/drawing/2016/ink" xmlns:am3d="http://schemas.microsoft.com/office/drawing/2017/model3d" xmlns:o="urn:schemas-microsoft-com:office:office" xmlns:oel="http://schemas.microsoft.com/office/2019/extlst" xmlns:r="http://schemas.openxmlformats.org/officeDocument/2006/relationships" xmlns:m="http://schemas.openxmlformats.org/officeDocument/2006/math" xmlns:v="urn:schemas-microsoft-com:vml" xmlns:wp14="http://schemas.microsoft.com/office/word/2010/wordprocessingDrawing" xmlns:wp="http://schemas.openxmlformats.org/drawingml/2006/wordprocessingDrawing" xmlns:w10="urn:schemas-microsoft-com:office:word" xmlns:w="http://schemas.openxmlformats.org/wordprocessingml/2006/main" xmlns:w14="http://schemas.microsoft.com/office/word/2010/wordml" xmlns:w15="http://schemas.microsoft.com/office/word/2012/wordml" xmlns:w16cex="http://schemas.microsoft.com/office/word/2018/wordml/cex" xmlns:w16cid="http://schemas.microsoft.com/office/word/2016/wordml/cid" xmlns:w16="http://schemas.microsoft.com/office/word/2018/wordml" xmlns:w16du="http://schemas.microsoft.com/office/word/2023/wordml/word16du" xmlns:w16sdtdh="http://schemas.microsoft.com/office/word/2020/wordml/sdtdatahash" xmlns:w16se="http://schemas.microsoft.com/office/word/2015/wordml/symex" xmlns:wpg="http://schemas.microsoft.com/office/word/2010/wordprocessingGroup" xmlns:wpi="http://schemas.microsoft.com/office/word/2010/wordprocessingInk" xmlns:wne="http://schemas.microsoft.com/office/word/2006/wordml" xmlns:wps="http://schemas.microsoft.com/office/word/2010/wordprocessingShape" mc:Ignorable="w14 w15 w16se w16cid w16 w16cex w16sdtdh w16du wp14">
+<w:endnotes xmlns:wpc="http://schemas.microsoft.com/office/word/2010/wordprocessingCanvas" xmlns:cx="http://schemas.microsoft.com/office/drawing/2014/chartex" xmlns:cx1="http://schemas.microsoft.com/office/drawing/2015/9/8/chartex" xmlns:cx2="http://schemas.microsoft.com/office/drawing/2015/10/21/chartex" xmlns:cx3="http://schemas.microsoft.com/office/drawing/2016/5/9/chartex" xmlns:cx4="http://schemas.microsoft.com/office/drawing/2016/5/10/chartex" xmlns:cx5="http://schemas.microsoft.com/office/drawing/2016/5/11/chartex" xmlns:cx6="http://schemas.microsoft.com/office/drawing/2016/5/12/chartex" xmlns:cx7="http://schemas.microsoft.com/office/drawing/2016/5/13/chartex" xmlns:cx8="http://schemas.microsoft.com/office/drawing/2016/5/14/chartex" xmlns:mc="http://schemas.openxmlformats.org/markup-compatibility/2006" xmlns:aink="http://schemas.microsoft.com/office/drawing/2016/ink" xmlns:am3d="http://schemas.microsoft.com/office/drawing/2017/model3d" xmlns:o="urn:schemas-microsoft-com:office:office" xmlns:oel="http://schemas.microsoft.com/office/2019/extlst" xmlns:r="http://schemas.openxmlformats.org/officeDocument/2006/relationships" xmlns:m="http://schemas.openxmlformats.org/officeDocument/2006/math" xmlns:v="urn:schemas-microsoft-com:vml" xmlns:wp14="http://schemas.microsoft.com/office/word/2010/wordprocessingDrawing" xmlns:wp="http://schemas.openxmlformats.org/drawingml/2006/wordprocessingDrawing" xmlns:w10="urn:schemas-microsoft-com:office:word" xmlns:w="http://schemas.openxmlformats.org/wordprocessingml/2006/main" xmlns:w14="http://schemas.microsoft.com/office/word/2010/wordml" xmlns:w15="http://schemas.microsoft.com/office/word/2012/wordml" xmlns:w16cex="http://schemas.microsoft.com/office/word/2018/wordml/cex" xmlns:w16cid="http://schemas.microsoft.com/office/word/2016/wordml/cid" xmlns:w16="http://schemas.microsoft.com/office/word/2018/wordml" xmlns:w16du="http://schemas.microsoft.com/office/word/2023/wordml/word16du" xmlns:w16sdtdh="http://schemas.microsoft.com/office/word/2020/wordml/sdtdatahash" xmlns:w16sdtfl="http://schemas.microsoft.com/office/word/2024/wordml/sdtformatlock" xmlns:w16se="http://schemas.microsoft.com/office/word/2015/wordml/symex" xmlns:wpg="http://schemas.microsoft.com/office/word/2010/wordprocessingGroup" xmlns:wpi="http://schemas.microsoft.com/office/word/2010/wordprocessingInk" xmlns:wne="http://schemas.microsoft.com/office/word/2006/wordml" xmlns:wps="http://schemas.microsoft.com/office/word/2010/wordprocessingShape" mc:Ignorable="w14 w15 w16se w16cid w16 w16cex w16sdtdh w16sdtfl w16du wp14">
   <w:endnote w:type="separator" w:id="-1">
     <w:p>
       <w:pPr>
@@ -36402,7 +36399,7 @@
 </file>
 
 <file path=word/footer1.xml><?xml version="1.0" encoding="utf-8"?>
-<w:ftr xmlns:wpc="http://schemas.microsoft.com/office/word/2010/wordprocessingCanvas" xmlns:cx="http://schemas.microsoft.com/office/drawing/2014/chartex" xmlns:cx1="http://schemas.microsoft.com/office/drawing/2015/9/8/chartex" xmlns:cx2="http://schemas.microsoft.com/office/drawing/2015/10/21/chartex" xmlns:cx3="http://schemas.microsoft.com/office/drawing/2016/5/9/chartex" xmlns:cx4="http://schemas.microsoft.com/office/drawing/2016/5/10/chartex" xmlns:cx5="http://schemas.microsoft.com/office/drawing/2016/5/11/chartex" xmlns:cx6="http://schemas.microsoft.com/office/drawing/2016/5/12/chartex" xmlns:cx7="http://schemas.microsoft.com/office/drawing/2016/5/13/chartex" xmlns:cx8="http://schemas.microsoft.com/office/drawing/2016/5/14/chartex" xmlns:mc="http://schemas.openxmlformats.org/markup-compatibility/2006" xmlns:aink="http://schemas.microsoft.com/office/drawing/2016/ink" xmlns:am3d="http://schemas.microsoft.com/office/drawing/2017/model3d" xmlns:o="urn:schemas-microsoft-com:office:office" xmlns:oel="http://schemas.microsoft.com/office/2019/extlst" xmlns:r="http://schemas.openxmlformats.org/officeDocument/2006/relationships" xmlns:m="http://schemas.openxmlformats.org/officeDocument/2006/math" xmlns:v="urn:schemas-microsoft-com:vml" xmlns:wp14="http://schemas.microsoft.com/office/word/2010/wordprocessingDrawing" xmlns:wp="http://schemas.openxmlformats.org/drawingml/2006/wordprocessingDrawing" xmlns:w10="urn:schemas-microsoft-com:office:word" xmlns:w="http://schemas.openxmlformats.org/wordprocessingml/2006/main" xmlns:w14="http://schemas.microsoft.com/office/word/2010/wordml" xmlns:w15="http://schemas.microsoft.com/office/word/2012/wordml" xmlns:w16cex="http://schemas.microsoft.com/office/word/2018/wordml/cex" xmlns:w16cid="http://schemas.microsoft.com/office/word/2016/wordml/cid" xmlns:w16="http://schemas.microsoft.com/office/word/2018/wordml" xmlns:w16du="http://schemas.microsoft.com/office/word/2023/wordml/word16du" xmlns:w16sdtdh="http://schemas.microsoft.com/office/word/2020/wordml/sdtdatahash" xmlns:w16se="http://schemas.microsoft.com/office/word/2015/wordml/symex" xmlns:wpg="http://schemas.microsoft.com/office/word/2010/wordprocessingGroup" xmlns:wpi="http://schemas.microsoft.com/office/word/2010/wordprocessingInk" xmlns:wne="http://schemas.microsoft.com/office/word/2006/wordml" xmlns:wps="http://schemas.microsoft.com/office/word/2010/wordprocessingShape" mc:Ignorable="w14 w15 w16se w16cid w16 w16cex w16sdtdh w16du wp14">
+<w:ftr xmlns:wpc="http://schemas.microsoft.com/office/word/2010/wordprocessingCanvas" xmlns:cx="http://schemas.microsoft.com/office/drawing/2014/chartex" xmlns:cx1="http://schemas.microsoft.com/office/drawing/2015/9/8/chartex" xmlns:cx2="http://schemas.microsoft.com/office/drawing/2015/10/21/chartex" xmlns:cx3="http://schemas.microsoft.com/office/drawing/2016/5/9/chartex" xmlns:cx4="http://schemas.microsoft.com/office/drawing/2016/5/10/chartex" xmlns:cx5="http://schemas.microsoft.com/office/drawing/2016/5/11/chartex" xmlns:cx6="http://schemas.microsoft.com/office/drawing/2016/5/12/chartex" xmlns:cx7="http://schemas.microsoft.com/office/drawing/2016/5/13/chartex" xmlns:cx8="http://schemas.microsoft.com/office/drawing/2016/5/14/chartex" xmlns:mc="http://schemas.openxmlformats.org/markup-compatibility/2006" xmlns:aink="http://schemas.microsoft.com/office/drawing/2016/ink" xmlns:am3d="http://schemas.microsoft.com/office/drawing/2017/model3d" xmlns:o="urn:schemas-microsoft-com:office:office" xmlns:oel="http://schemas.microsoft.com/office/2019/extlst" xmlns:r="http://schemas.openxmlformats.org/officeDocument/2006/relationships" xmlns:m="http://schemas.openxmlformats.org/officeDocument/2006/math" xmlns:v="urn:schemas-microsoft-com:vml" xmlns:wp14="http://schemas.microsoft.com/office/word/2010/wordprocessingDrawing" xmlns:wp="http://schemas.openxmlformats.org/drawingml/2006/wordprocessingDrawing" xmlns:w10="urn:schemas-microsoft-com:office:word" xmlns:w="http://schemas.openxmlformats.org/wordprocessingml/2006/main" xmlns:w14="http://schemas.microsoft.com/office/word/2010/wordml" xmlns:w15="http://schemas.microsoft.com/office/word/2012/wordml" xmlns:w16cex="http://schemas.microsoft.com/office/word/2018/wordml/cex" xmlns:w16cid="http://schemas.microsoft.com/office/word/2016/wordml/cid" xmlns:w16="http://schemas.microsoft.com/office/word/2018/wordml" xmlns:w16du="http://schemas.microsoft.com/office/word/2023/wordml/word16du" xmlns:w16sdtdh="http://schemas.microsoft.com/office/word/2020/wordml/sdtdatahash" xmlns:w16sdtfl="http://schemas.microsoft.com/office/word/2024/wordml/sdtformatlock" xmlns:w16se="http://schemas.microsoft.com/office/word/2015/wordml/symex" xmlns:wpg="http://schemas.microsoft.com/office/word/2010/wordprocessingGroup" xmlns:wpi="http://schemas.microsoft.com/office/word/2010/wordprocessingInk" xmlns:wne="http://schemas.microsoft.com/office/word/2006/wordml" xmlns:wps="http://schemas.microsoft.com/office/word/2010/wordprocessingShape" mc:Ignorable="w14 w15 w16se w16cid w16 w16cex w16sdtdh w16sdtfl w16du wp14">
   <w:p>
     <w:pPr>
       <w:pStyle w:val="Footer"/>
@@ -36413,7 +36410,7 @@
 </file>
 
 <file path=word/footer2.xml><?xml version="1.0" encoding="utf-8"?>
-<w:ftr xmlns:wpc="http://schemas.microsoft.com/office/word/2010/wordprocessingCanvas" xmlns:cx="http://schemas.microsoft.com/office/drawing/2014/chartex" xmlns:cx1="http://schemas.microsoft.com/office/drawing/2015/9/8/chartex" xmlns:cx2="http://schemas.microsoft.com/office/drawing/2015/10/21/chartex" xmlns:cx3="http://schemas.microsoft.com/office/drawing/2016/5/9/chartex" xmlns:cx4="http://schemas.microsoft.com/office/drawing/2016/5/10/chartex" xmlns:cx5="http://schemas.microsoft.com/office/drawing/2016/5/11/chartex" xmlns:cx6="http://schemas.microsoft.com/office/drawing/2016/5/12/chartex" xmlns:cx7="http://schemas.microsoft.com/office/drawing/2016/5/13/chartex" xmlns:cx8="http://schemas.microsoft.com/office/drawing/2016/5/14/chartex" xmlns:mc="http://schemas.openxmlformats.org/markup-compatibility/2006" xmlns:aink="http://schemas.microsoft.com/office/drawing/2016/ink" xmlns:am3d="http://schemas.microsoft.com/office/drawing/2017/model3d" xmlns:o="urn:schemas-microsoft-com:office:office" xmlns:oel="http://schemas.microsoft.com/office/2019/extlst" xmlns:r="http://schemas.openxmlformats.org/officeDocument/2006/relationships" xmlns:m="http://schemas.openxmlformats.org/officeDocument/2006/math" xmlns:v="urn:schemas-microsoft-com:vml" xmlns:wp14="http://schemas.microsoft.com/office/word/2010/wordprocessingDrawing" xmlns:wp="http://schemas.openxmlformats.org/drawingml/2006/wordprocessingDrawing" xmlns:w10="urn:schemas-microsoft-com:office:word" xmlns:w="http://schemas.openxmlformats.org/wordprocessingml/2006/main" xmlns:w14="http://schemas.microsoft.com/office/word/2010/wordml" xmlns:w15="http://schemas.microsoft.com/office/word/2012/wordml" xmlns:w16cex="http://schemas.microsoft.com/office/word/2018/wordml/cex" xmlns:w16cid="http://schemas.microsoft.com/office/word/2016/wordml/cid" xmlns:w16="http://schemas.microsoft.com/office/word/2018/wordml" xmlns:w16du="http://schemas.microsoft.com/office/word/2023/wordml/word16du" xmlns:w16sdtdh="http://schemas.microsoft.com/office/word/2020/wordml/sdtdatahash" xmlns:w16se="http://schemas.microsoft.com/office/word/2015/wordml/symex" xmlns:wpg="http://schemas.microsoft.com/office/word/2010/wordprocessingGroup" xmlns:wpi="http://schemas.microsoft.com/office/word/2010/wordprocessingInk" xmlns:wne="http://schemas.microsoft.com/office/word/2006/wordml" xmlns:wps="http://schemas.microsoft.com/office/word/2010/wordprocessingShape" mc:Ignorable="w14 w15 w16se w16cid w16 w16cex w16sdtdh w16du wp14">
+<w:ftr xmlns:wpc="http://schemas.microsoft.com/office/word/2010/wordprocessingCanvas" xmlns:cx="http://schemas.microsoft.com/office/drawing/2014/chartex" xmlns:cx1="http://schemas.microsoft.com/office/drawing/2015/9/8/chartex" xmlns:cx2="http://schemas.microsoft.com/office/drawing/2015/10/21/chartex" xmlns:cx3="http://schemas.microsoft.com/office/drawing/2016/5/9/chartex" xmlns:cx4="http://schemas.microsoft.com/office/drawing/2016/5/10/chartex" xmlns:cx5="http://schemas.microsoft.com/office/drawing/2016/5/11/chartex" xmlns:cx6="http://schemas.microsoft.com/office/drawing/2016/5/12/chartex" xmlns:cx7="http://schemas.microsoft.com/office/drawing/2016/5/13/chartex" xmlns:cx8="http://schemas.microsoft.com/office/drawing/2016/5/14/chartex" xmlns:mc="http://schemas.openxmlformats.org/markup-compatibility/2006" xmlns:aink="http://schemas.microsoft.com/office/drawing/2016/ink" xmlns:am3d="http://schemas.microsoft.com/office/drawing/2017/model3d" xmlns:o="urn:schemas-microsoft-com:office:office" xmlns:oel="http://schemas.microsoft.com/office/2019/extlst" xmlns:r="http://schemas.openxmlformats.org/officeDocument/2006/relationships" xmlns:m="http://schemas.openxmlformats.org/officeDocument/2006/math" xmlns:v="urn:schemas-microsoft-com:vml" xmlns:wp14="http://schemas.microsoft.com/office/word/2010/wordprocessingDrawing" xmlns:wp="http://schemas.openxmlformats.org/drawingml/2006/wordprocessingDrawing" xmlns:w10="urn:schemas-microsoft-com:office:word" xmlns:w="http://schemas.openxmlformats.org/wordprocessingml/2006/main" xmlns:w14="http://schemas.microsoft.com/office/word/2010/wordml" xmlns:w15="http://schemas.microsoft.com/office/word/2012/wordml" xmlns:w16cex="http://schemas.microsoft.com/office/word/2018/wordml/cex" xmlns:w16cid="http://schemas.microsoft.com/office/word/2016/wordml/cid" xmlns:w16="http://schemas.microsoft.com/office/word/2018/wordml" xmlns:w16du="http://schemas.microsoft.com/office/word/2023/wordml/word16du" xmlns:w16sdtdh="http://schemas.microsoft.com/office/word/2020/wordml/sdtdatahash" xmlns:w16sdtfl="http://schemas.microsoft.com/office/word/2024/wordml/sdtformatlock" xmlns:w16se="http://schemas.microsoft.com/office/word/2015/wordml/symex" xmlns:wpg="http://schemas.microsoft.com/office/word/2010/wordprocessingGroup" xmlns:wpi="http://schemas.microsoft.com/office/word/2010/wordprocessingInk" xmlns:wne="http://schemas.microsoft.com/office/word/2006/wordml" xmlns:wps="http://schemas.microsoft.com/office/word/2010/wordprocessingShape" mc:Ignorable="w14 w15 w16se w16cid w16 w16cex w16sdtdh w16sdtfl w16du wp14">
   <w:p>
     <w:pPr>
       <w:pStyle w:val="Footer"/>
@@ -36424,7 +36421,7 @@
 </file>
 
 <file path=word/footnotes.xml><?xml version="1.0" encoding="utf-8"?>
-<w:footnotes xmlns:wpc="http://schemas.microsoft.com/office/word/2010/wordprocessingCanvas" xmlns:cx="http://schemas.microsoft.com/office/drawing/2014/chartex" xmlns:cx1="http://schemas.microsoft.com/office/drawing/2015/9/8/chartex" xmlns:cx2="http://schemas.microsoft.com/office/drawing/2015/10/21/chartex" xmlns:cx3="http://schemas.microsoft.com/office/drawing/2016/5/9/chartex" xmlns:cx4="http://schemas.microsoft.com/office/drawing/2016/5/10/chartex" xmlns:cx5="http://schemas.microsoft.com/office/drawing/2016/5/11/chartex" xmlns:cx6="http://schemas.microsoft.com/office/drawing/2016/5/12/chartex" xmlns:cx7="http://schemas.microsoft.com/office/drawing/2016/5/13/chartex" xmlns:cx8="http://schemas.microsoft.com/office/drawing/2016/5/14/chartex" xmlns:mc="http://schemas.openxmlformats.org/markup-compatibility/2006" xmlns:aink="http://schemas.microsoft.com/office/drawing/2016/ink" xmlns:am3d="http://schemas.microsoft.com/office/drawing/2017/model3d" xmlns:o="urn:schemas-microsoft-com:office:office" xmlns:oel="http://schemas.microsoft.com/office/2019/extlst" xmlns:r="http://schemas.openxmlformats.org/officeDocument/2006/relationships" xmlns:m="http://schemas.openxmlformats.org/officeDocument/2006/math" xmlns:v="urn:schemas-microsoft-com:vml" xmlns:wp14="http://schemas.microsoft.com/office/word/2010/wordprocessingDrawing" xmlns:wp="http://schemas.openxmlformats.org/drawingml/2006/wordprocessingDrawing" xmlns:w10="urn:schemas-microsoft-com:office:word" xmlns:w="http://schemas.openxmlformats.org/wordprocessingml/2006/main" xmlns:w14="http://schemas.microsoft.com/office/word/2010/wordml" xmlns:w15="http://schemas.microsoft.com/office/word/2012/wordml" xmlns:w16cex="http://schemas.microsoft.com/office/word/2018/wordml/cex" xmlns:w16cid="http://schemas.microsoft.com/office/word/2016/wordml/cid" xmlns:w16="http://schemas.microsoft.com/office/word/2018/wordml" xmlns:w16du="http://schemas.microsoft.com/office/word/2023/wordml/word16du" xmlns:w16sdtdh="http://schemas.microsoft.com/office/word/2020/wordml/sdtdatahash" xmlns:w16se="http://schemas.microsoft.com/office/word/2015/wordml/symex" xmlns:wpg="http://schemas.microsoft.com/office/word/2010/wordprocessingGroup" xmlns:wpi="http://schemas.microsoft.com/office/word/2010/wordprocessingInk" xmlns:wne="http://schemas.microsoft.com/office/word/2006/wordml" xmlns:wps="http://schemas.microsoft.com/office/word/2010/wordprocessingShape" mc:Ignorable="w14 w15 w16se w16cid w16 w16cex w16sdtdh w16du wp14">
+<w:footnotes xmlns:wpc="http://schemas.microsoft.com/office/word/2010/wordprocessingCanvas" xmlns:cx="http://schemas.microsoft.com/office/drawing/2014/chartex" xmlns:cx1="http://schemas.microsoft.com/office/drawing/2015/9/8/chartex" xmlns:cx2="http://schemas.microsoft.com/office/drawing/2015/10/21/chartex" xmlns:cx3="http://schemas.microsoft.com/office/drawing/2016/5/9/chartex" xmlns:cx4="http://schemas.microsoft.com/office/drawing/2016/5/10/chartex" xmlns:cx5="http://schemas.microsoft.com/office/drawing/2016/5/11/chartex" xmlns:cx6="http://schemas.microsoft.com/office/drawing/2016/5/12/chartex" xmlns:cx7="http://schemas.microsoft.com/office/drawing/2016/5/13/chartex" xmlns:cx8="http://schemas.microsoft.com/office/drawing/2016/5/14/chartex" xmlns:mc="http://schemas.openxmlformats.org/markup-compatibility/2006" xmlns:aink="http://schemas.microsoft.com/office/drawing/2016/ink" xmlns:am3d="http://schemas.microsoft.com/office/drawing/2017/model3d" xmlns:o="urn:schemas-microsoft-com:office:office" xmlns:oel="http://schemas.microsoft.com/office/2019/extlst" xmlns:r="http://schemas.openxmlformats.org/officeDocument/2006/relationships" xmlns:m="http://schemas.openxmlformats.org/officeDocument/2006/math" xmlns:v="urn:schemas-microsoft-com:vml" xmlns:wp14="http://schemas.microsoft.com/office/word/2010/wordprocessingDrawing" xmlns:wp="http://schemas.openxmlformats.org/drawingml/2006/wordprocessingDrawing" xmlns:w10="urn:schemas-microsoft-com:office:word" xmlns:w="http://schemas.openxmlformats.org/wordprocessingml/2006/main" xmlns:w14="http://schemas.microsoft.com/office/word/2010/wordml" xmlns:w15="http://schemas.microsoft.com/office/word/2012/wordml" xmlns:w16cex="http://schemas.microsoft.com/office/word/2018/wordml/cex" xmlns:w16cid="http://schemas.microsoft.com/office/word/2016/wordml/cid" xmlns:w16="http://schemas.microsoft.com/office/word/2018/wordml" xmlns:w16du="http://schemas.microsoft.com/office/word/2023/wordml/word16du" xmlns:w16sdtdh="http://schemas.microsoft.com/office/word/2020/wordml/sdtdatahash" xmlns:w16sdtfl="http://schemas.microsoft.com/office/word/2024/wordml/sdtformatlock" xmlns:w16se="http://schemas.microsoft.com/office/word/2015/wordml/symex" xmlns:wpg="http://schemas.microsoft.com/office/word/2010/wordprocessingGroup" xmlns:wpi="http://schemas.microsoft.com/office/word/2010/wordprocessingInk" xmlns:wne="http://schemas.microsoft.com/office/word/2006/wordml" xmlns:wps="http://schemas.microsoft.com/office/word/2010/wordprocessingShape" mc:Ignorable="w14 w15 w16se w16cid w16 w16cex w16sdtdh w16sdtfl w16du wp14">
   <w:footnote w:type="separator" w:id="-1">
     <w:p>
       <w:pPr>
@@ -36456,7 +36453,7 @@
 </file>
 
 <file path=word/header1.xml><?xml version="1.0" encoding="utf-8"?>
-<w:hdr xmlns:wpc="http://schemas.microsoft.com/office/word/2010/wordprocessingCanvas" xmlns:cx="http://schemas.microsoft.com/office/drawing/2014/chartex" xmlns:cx1="http://schemas.microsoft.com/office/drawing/2015/9/8/chartex" xmlns:cx2="http://schemas.microsoft.com/office/drawing/2015/10/21/chartex" xmlns:cx3="http://schemas.microsoft.com/office/drawing/2016/5/9/chartex" xmlns:cx4="http://schemas.microsoft.com/office/drawing/2016/5/10/chartex" xmlns:cx5="http://schemas.microsoft.com/office/drawing/2016/5/11/chartex" xmlns:cx6="http://schemas.microsoft.com/office/drawing/2016/5/12/chartex" xmlns:cx7="http://schemas.microsoft.com/office/drawing/2016/5/13/chartex" xmlns:cx8="http://schemas.microsoft.com/office/drawing/2016/5/14/chartex" xmlns:mc="http://schemas.openxmlformats.org/markup-compatibility/2006" xmlns:aink="http://schemas.microsoft.com/office/drawing/2016/ink" xmlns:am3d="http://schemas.microsoft.com/office/drawing/2017/model3d" xmlns:o="urn:schemas-microsoft-com:office:office" xmlns:oel="http://schemas.microsoft.com/office/2019/extlst" xmlns:r="http://schemas.openxmlformats.org/officeDocument/2006/relationships" xmlns:m="http://schemas.openxmlformats.org/officeDocument/2006/math" xmlns:v="urn:schemas-microsoft-com:vml" xmlns:wp14="http://schemas.microsoft.com/office/word/2010/wordprocessingDrawing" xmlns:wp="http://schemas.openxmlformats.org/drawingml/2006/wordprocessingDrawing" xmlns:w10="urn:schemas-microsoft-com:office:word" xmlns:w="http://schemas.openxmlformats.org/wordprocessingml/2006/main" xmlns:w14="http://schemas.microsoft.com/office/word/2010/wordml" xmlns:w15="http://schemas.microsoft.com/office/word/2012/wordml" xmlns:w16cex="http://schemas.microsoft.com/office/word/2018/wordml/cex" xmlns:w16cid="http://schemas.microsoft.com/office/word/2016/wordml/cid" xmlns:w16="http://schemas.microsoft.com/office/word/2018/wordml" xmlns:w16du="http://schemas.microsoft.com/office/word/2023/wordml/word16du" xmlns:w16sdtdh="http://schemas.microsoft.com/office/word/2020/wordml/sdtdatahash" xmlns:w16se="http://schemas.microsoft.com/office/word/2015/wordml/symex" xmlns:wpg="http://schemas.microsoft.com/office/word/2010/wordprocessingGroup" xmlns:wpi="http://schemas.microsoft.com/office/word/2010/wordprocessingInk" xmlns:wne="http://schemas.microsoft.com/office/word/2006/wordml" xmlns:wps="http://schemas.microsoft.com/office/word/2010/wordprocessingShape" mc:Ignorable="w14 w15 w16se w16cid w16 w16cex w16sdtdh w16du wp14">
+<w:hdr xmlns:wpc="http://schemas.microsoft.com/office/word/2010/wordprocessingCanvas" xmlns:cx="http://schemas.microsoft.com/office/drawing/2014/chartex" xmlns:cx1="http://schemas.microsoft.com/office/drawing/2015/9/8/chartex" xmlns:cx2="http://schemas.microsoft.com/office/drawing/2015/10/21/chartex" xmlns:cx3="http://schemas.microsoft.com/office/drawing/2016/5/9/chartex" xmlns:cx4="http://schemas.microsoft.com/office/drawing/2016/5/10/chartex" xmlns:cx5="http://schemas.microsoft.com/office/drawing/2016/5/11/chartex" xmlns:cx6="http://schemas.microsoft.com/office/drawing/2016/5/12/chartex" xmlns:cx7="http://schemas.microsoft.com/office/drawing/2016/5/13/chartex" xmlns:cx8="http://schemas.microsoft.com/office/drawing/2016/5/14/chartex" xmlns:mc="http://schemas.openxmlformats.org/markup-compatibility/2006" xmlns:aink="http://schemas.microsoft.com/office/drawing/2016/ink" xmlns:am3d="http://schemas.microsoft.com/office/drawing/2017/model3d" xmlns:o="urn:schemas-microsoft-com:office:office" xmlns:oel="http://schemas.microsoft.com/office/2019/extlst" xmlns:r="http://schemas.openxmlformats.org/officeDocument/2006/relationships" xmlns:m="http://schemas.openxmlformats.org/officeDocument/2006/math" xmlns:v="urn:schemas-microsoft-com:vml" xmlns:wp14="http://schemas.microsoft.com/office/word/2010/wordprocessingDrawing" xmlns:wp="http://schemas.openxmlformats.org/drawingml/2006/wordprocessingDrawing" xmlns:w10="urn:schemas-microsoft-com:office:word" xmlns:w="http://schemas.openxmlformats.org/wordprocessingml/2006/main" xmlns:w14="http://schemas.microsoft.com/office/word/2010/wordml" xmlns:w15="http://schemas.microsoft.com/office/word/2012/wordml" xmlns:w16cex="http://schemas.microsoft.com/office/word/2018/wordml/cex" xmlns:w16cid="http://schemas.microsoft.com/office/word/2016/wordml/cid" xmlns:w16="http://schemas.microsoft.com/office/word/2018/wordml" xmlns:w16du="http://schemas.microsoft.com/office/word/2023/wordml/word16du" xmlns:w16sdtdh="http://schemas.microsoft.com/office/word/2020/wordml/sdtdatahash" xmlns:w16sdtfl="http://schemas.microsoft.com/office/word/2024/wordml/sdtformatlock" xmlns:w16se="http://schemas.microsoft.com/office/word/2015/wordml/symex" xmlns:wpg="http://schemas.microsoft.com/office/word/2010/wordprocessingGroup" xmlns:wpi="http://schemas.microsoft.com/office/word/2010/wordprocessingInk" xmlns:wne="http://schemas.microsoft.com/office/word/2006/wordml" xmlns:wps="http://schemas.microsoft.com/office/word/2010/wordprocessingShape" mc:Ignorable="w14 w15 w16se w16cid w16 w16cex w16sdtdh w16sdtfl w16du wp14">
   <w:p>
     <w:pPr>
       <w:pStyle w:val="Header"/>
@@ -36500,7 +36497,7 @@
 </file>
 
 <file path=word/header2.xml><?xml version="1.0" encoding="utf-8"?>
-<w:hdr xmlns:wpc="http://schemas.microsoft.com/office/word/2010/wordprocessingCanvas" xmlns:cx="http://schemas.microsoft.com/office/drawing/2014/chartex" xmlns:cx1="http://schemas.microsoft.com/office/drawing/2015/9/8/chartex" xmlns:cx2="http://schemas.microsoft.com/office/drawing/2015/10/21/chartex" xmlns:cx3="http://schemas.microsoft.com/office/drawing/2016/5/9/chartex" xmlns:cx4="http://schemas.microsoft.com/office/drawing/2016/5/10/chartex" xmlns:cx5="http://schemas.microsoft.com/office/drawing/2016/5/11/chartex" xmlns:cx6="http://schemas.microsoft.com/office/drawing/2016/5/12/chartex" xmlns:cx7="http://schemas.microsoft.com/office/drawing/2016/5/13/chartex" xmlns:cx8="http://schemas.microsoft.com/office/drawing/2016/5/14/chartex" xmlns:mc="http://schemas.openxmlformats.org/markup-compatibility/2006" xmlns:aink="http://schemas.microsoft.com/office/drawing/2016/ink" xmlns:am3d="http://schemas.microsoft.com/office/drawing/2017/model3d" xmlns:o="urn:schemas-microsoft-com:office:office" xmlns:oel="http://schemas.microsoft.com/office/2019/extlst" xmlns:r="http://schemas.openxmlformats.org/officeDocument/2006/relationships" xmlns:m="http://schemas.openxmlformats.org/officeDocument/2006/math" xmlns:v="urn:schemas-microsoft-com:vml" xmlns:wp14="http://schemas.microsoft.com/office/word/2010/wordprocessingDrawing" xmlns:wp="http://schemas.openxmlformats.org/drawingml/2006/wordprocessingDrawing" xmlns:w10="urn:schemas-microsoft-com:office:word" xmlns:w="http://schemas.openxmlformats.org/wordprocessingml/2006/main" xmlns:w14="http://schemas.microsoft.com/office/word/2010/wordml" xmlns:w15="http://schemas.microsoft.com/office/word/2012/wordml" xmlns:w16cex="http://schemas.microsoft.com/office/word/2018/wordml/cex" xmlns:w16cid="http://schemas.microsoft.com/office/word/2016/wordml/cid" xmlns:w16="http://schemas.microsoft.com/office/word/2018/wordml" xmlns:w16du="http://schemas.microsoft.com/office/word/2023/wordml/word16du" xmlns:w16sdtdh="http://schemas.microsoft.com/office/word/2020/wordml/sdtdatahash" xmlns:w16se="http://schemas.microsoft.com/office/word/2015/wordml/symex" xmlns:wpg="http://schemas.microsoft.com/office/word/2010/wordprocessingGroup" xmlns:wpi="http://schemas.microsoft.com/office/word/2010/wordprocessingInk" xmlns:wne="http://schemas.microsoft.com/office/word/2006/wordml" xmlns:wps="http://schemas.microsoft.com/office/word/2010/wordprocessingShape" mc:Ignorable="w14 w15 w16se w16cid w16 w16cex w16sdtdh w16du wp14">
+<w:hdr xmlns:wpc="http://schemas.microsoft.com/office/word/2010/wordprocessingCanvas" xmlns:cx="http://schemas.microsoft.com/office/drawing/2014/chartex" xmlns:cx1="http://schemas.microsoft.com/office/drawing/2015/9/8/chartex" xmlns:cx2="http://schemas.microsoft.com/office/drawing/2015/10/21/chartex" xmlns:cx3="http://schemas.microsoft.com/office/drawing/2016/5/9/chartex" xmlns:cx4="http://schemas.microsoft.com/office/drawing/2016/5/10/chartex" xmlns:cx5="http://schemas.microsoft.com/office/drawing/2016/5/11/chartex" xmlns:cx6="http://schemas.microsoft.com/office/drawing/2016/5/12/chartex" xmlns:cx7="http://schemas.microsoft.com/office/drawing/2016/5/13/chartex" xmlns:cx8="http://schemas.microsoft.com/office/drawing/2016/5/14/chartex" xmlns:mc="http://schemas.openxmlformats.org/markup-compatibility/2006" xmlns:aink="http://schemas.microsoft.com/office/drawing/2016/ink" xmlns:am3d="http://schemas.microsoft.com/office/drawing/2017/model3d" xmlns:o="urn:schemas-microsoft-com:office:office" xmlns:oel="http://schemas.microsoft.com/office/2019/extlst" xmlns:r="http://schemas.openxmlformats.org/officeDocument/2006/relationships" xmlns:m="http://schemas.openxmlformats.org/officeDocument/2006/math" xmlns:v="urn:schemas-microsoft-com:vml" xmlns:wp14="http://schemas.microsoft.com/office/word/2010/wordprocessingDrawing" xmlns:wp="http://schemas.openxmlformats.org/drawingml/2006/wordprocessingDrawing" xmlns:w10="urn:schemas-microsoft-com:office:word" xmlns:w="http://schemas.openxmlformats.org/wordprocessingml/2006/main" xmlns:w14="http://schemas.microsoft.com/office/word/2010/wordml" xmlns:w15="http://schemas.microsoft.com/office/word/2012/wordml" xmlns:w16cex="http://schemas.microsoft.com/office/word/2018/wordml/cex" xmlns:w16cid="http://schemas.microsoft.com/office/word/2016/wordml/cid" xmlns:w16="http://schemas.microsoft.com/office/word/2018/wordml" xmlns:w16du="http://schemas.microsoft.com/office/word/2023/wordml/word16du" xmlns:w16sdtdh="http://schemas.microsoft.com/office/word/2020/wordml/sdtdatahash" xmlns:w16sdtfl="http://schemas.microsoft.com/office/word/2024/wordml/sdtformatlock" xmlns:w16se="http://schemas.microsoft.com/office/word/2015/wordml/symex" xmlns:wpg="http://schemas.microsoft.com/office/word/2010/wordprocessingGroup" xmlns:wpi="http://schemas.microsoft.com/office/word/2010/wordprocessingInk" xmlns:wne="http://schemas.microsoft.com/office/word/2006/wordml" xmlns:wps="http://schemas.microsoft.com/office/word/2010/wordprocessingShape" mc:Ignorable="w14 w15 w16se w16cid w16 w16cex w16sdtdh w16sdtfl w16du wp14">
   <w:p>
     <w:pPr>
       <w:pStyle w:val="Header"/>
@@ -36576,7 +36573,7 @@
 </file>
 
 <file path=word/numbering.xml><?xml version="1.0" encoding="utf-8"?>
-<w:numbering xmlns:wpc="http://schemas.microsoft.com/office/word/2010/wordprocessingCanvas" xmlns:cx="http://schemas.microsoft.com/office/drawing/2014/chartex" xmlns:cx1="http://schemas.microsoft.com/office/drawing/2015/9/8/chartex" xmlns:cx2="http://schemas.microsoft.com/office/drawing/2015/10/21/chartex" xmlns:cx3="http://schemas.microsoft.com/office/drawing/2016/5/9/chartex" xmlns:cx4="http://schemas.microsoft.com/office/drawing/2016/5/10/chartex" xmlns:cx5="http://schemas.microsoft.com/office/drawing/2016/5/11/chartex" xmlns:cx6="http://schemas.microsoft.com/office/drawing/2016/5/12/chartex" xmlns:cx7="http://schemas.microsoft.com/office/drawing/2016/5/13/chartex" xmlns:cx8="http://schemas.microsoft.com/office/drawing/2016/5/14/chartex" xmlns:mc="http://schemas.openxmlformats.org/markup-compatibility/2006" xmlns:aink="http://schemas.microsoft.com/office/drawing/2016/ink" xmlns:am3d="http://schemas.microsoft.com/office/drawing/2017/model3d" xmlns:o="urn:schemas-microsoft-com:office:office" xmlns:oel="http://schemas.microsoft.com/office/2019/extlst" xmlns:r="http://schemas.openxmlformats.org/officeDocument/2006/relationships" xmlns:m="http://schemas.openxmlformats.org/officeDocument/2006/math" xmlns:v="urn:schemas-microsoft-com:vml" xmlns:wp14="http://schemas.microsoft.com/office/word/2010/wordprocessingDrawing" xmlns:wp="http://schemas.openxmlformats.org/drawingml/2006/wordprocessingDrawing" xmlns:w10="urn:schemas-microsoft-com:office:word" xmlns:w="http://schemas.openxmlformats.org/wordprocessingml/2006/main" xmlns:w14="http://schemas.microsoft.com/office/word/2010/wordml" xmlns:w15="http://schemas.microsoft.com/office/word/2012/wordml" xmlns:w16cex="http://schemas.microsoft.com/office/word/2018/wordml/cex" xmlns:w16cid="http://schemas.microsoft.com/office/word/2016/wordml/cid" xmlns:w16="http://schemas.microsoft.com/office/word/2018/wordml" xmlns:w16du="http://schemas.microsoft.com/office/word/2023/wordml/word16du" xmlns:w16sdtdh="http://schemas.microsoft.com/office/word/2020/wordml/sdtdatahash" xmlns:w16se="http://schemas.microsoft.com/office/word/2015/wordml/symex" xmlns:wpg="http://schemas.microsoft.com/office/word/2010/wordprocessingGroup" xmlns:wpi="http://schemas.microsoft.com/office/word/2010/wordprocessingInk" xmlns:wne="http://schemas.microsoft.com/office/word/2006/wordml" xmlns:wps="http://schemas.microsoft.com/office/word/2010/wordprocessingShape" mc:Ignorable="w14 w15 w16se w16cid w16 w16cex w16sdtdh w16du wp14">
+<w:numbering xmlns:wpc="http://schemas.microsoft.com/office/word/2010/wordprocessingCanvas" xmlns:cx="http://schemas.microsoft.com/office/drawing/2014/chartex" xmlns:cx1="http://schemas.microsoft.com/office/drawing/2015/9/8/chartex" xmlns:cx2="http://schemas.microsoft.com/office/drawing/2015/10/21/chartex" xmlns:cx3="http://schemas.microsoft.com/office/drawing/2016/5/9/chartex" xmlns:cx4="http://schemas.microsoft.com/office/drawing/2016/5/10/chartex" xmlns:cx5="http://schemas.microsoft.com/office/drawing/2016/5/11/chartex" xmlns:cx6="http://schemas.microsoft.com/office/drawing/2016/5/12/chartex" xmlns:cx7="http://schemas.microsoft.com/office/drawing/2016/5/13/chartex" xmlns:cx8="http://schemas.microsoft.com/office/drawing/2016/5/14/chartex" xmlns:mc="http://schemas.openxmlformats.org/markup-compatibility/2006" xmlns:aink="http://schemas.microsoft.com/office/drawing/2016/ink" xmlns:am3d="http://schemas.microsoft.com/office/drawing/2017/model3d" xmlns:o="urn:schemas-microsoft-com:office:office" xmlns:oel="http://schemas.microsoft.com/office/2019/extlst" xmlns:r="http://schemas.openxmlformats.org/officeDocument/2006/relationships" xmlns:m="http://schemas.openxmlformats.org/officeDocument/2006/math" xmlns:v="urn:schemas-microsoft-com:vml" xmlns:wp14="http://schemas.microsoft.com/office/word/2010/wordprocessingDrawing" xmlns:wp="http://schemas.openxmlformats.org/drawingml/2006/wordprocessingDrawing" xmlns:w10="urn:schemas-microsoft-com:office:word" xmlns:w="http://schemas.openxmlformats.org/wordprocessingml/2006/main" xmlns:w14="http://schemas.microsoft.com/office/word/2010/wordml" xmlns:w15="http://schemas.microsoft.com/office/word/2012/wordml" xmlns:w16cex="http://schemas.microsoft.com/office/word/2018/wordml/cex" xmlns:w16cid="http://schemas.microsoft.com/office/word/2016/wordml/cid" xmlns:w16="http://schemas.microsoft.com/office/word/2018/wordml" xmlns:w16du="http://schemas.microsoft.com/office/word/2023/wordml/word16du" xmlns:w16sdtdh="http://schemas.microsoft.com/office/word/2020/wordml/sdtdatahash" xmlns:w16sdtfl="http://schemas.microsoft.com/office/word/2024/wordml/sdtformatlock" xmlns:w16se="http://schemas.microsoft.com/office/word/2015/wordml/symex" xmlns:wpg="http://schemas.microsoft.com/office/word/2010/wordprocessingGroup" xmlns:wpi="http://schemas.microsoft.com/office/word/2010/wordprocessingInk" xmlns:wne="http://schemas.microsoft.com/office/word/2006/wordml" xmlns:wps="http://schemas.microsoft.com/office/word/2010/wordprocessingShape" mc:Ignorable="w14 w15 w16se w16cid w16 w16cex w16sdtdh w16sdtfl w16du wp14">
   <w:abstractNum w:abstractNumId="0" w15:restartNumberingAfterBreak="0">
     <w:nsid w:val="05D56A7F"/>
     <w:multiLevelType w:val="hybridMultilevel"/>
@@ -41143,7 +41140,7 @@
 </file>
 
 <file path=word/styles.xml><?xml version="1.0" encoding="utf-8"?>
-<w:styles xmlns:mc="http://schemas.openxmlformats.org/markup-compatibility/2006" xmlns:r="http://schemas.openxmlformats.org/officeDocument/2006/relationships" xmlns:w="http://schemas.openxmlformats.org/wordprocessingml/2006/main" xmlns:w14="http://schemas.microsoft.com/office/word/2010/wordml" xmlns:w15="http://schemas.microsoft.com/office/word/2012/wordml" xmlns:w16cex="http://schemas.microsoft.com/office/word/2018/wordml/cex" xmlns:w16cid="http://schemas.microsoft.com/office/word/2016/wordml/cid" xmlns:w16="http://schemas.microsoft.com/office/word/2018/wordml" xmlns:w16du="http://schemas.microsoft.com/office/word/2023/wordml/word16du" xmlns:w16sdtdh="http://schemas.microsoft.com/office/word/2020/wordml/sdtdatahash" xmlns:w16se="http://schemas.microsoft.com/office/word/2015/wordml/symex" mc:Ignorable="w14 w15 w16se w16cid w16 w16cex w16sdtdh w16du">
+<w:styles xmlns:mc="http://schemas.openxmlformats.org/markup-compatibility/2006" xmlns:r="http://schemas.openxmlformats.org/officeDocument/2006/relationships" xmlns:w="http://schemas.openxmlformats.org/wordprocessingml/2006/main" xmlns:w14="http://schemas.microsoft.com/office/word/2010/wordml" xmlns:w15="http://schemas.microsoft.com/office/word/2012/wordml" xmlns:w16cex="http://schemas.microsoft.com/office/word/2018/wordml/cex" xmlns:w16cid="http://schemas.microsoft.com/office/word/2016/wordml/cid" xmlns:w16="http://schemas.microsoft.com/office/word/2018/wordml" xmlns:w16du="http://schemas.microsoft.com/office/word/2023/wordml/word16du" xmlns:w16sdtdh="http://schemas.microsoft.com/office/word/2020/wordml/sdtdatahash" xmlns:w16sdtfl="http://schemas.microsoft.com/office/word/2024/wordml/sdtformatlock" xmlns:w16se="http://schemas.microsoft.com/office/word/2015/wordml/symex" mc:Ignorable="w14 w15 w16se w16cid w16 w16cex w16sdtdh w16sdtfl w16du">
   <w:docDefaults>
     <w:rPrDefault>
       <w:rPr>
@@ -41791,6 +41788,7 @@
   <w:style w:type="character" w:default="1" w:styleId="DefaultParagraphFont">
     <w:name w:val="Default Paragraph Font"/>
     <w:uiPriority w:val="1"/>
+    <w:semiHidden/>
     <w:unhideWhenUsed/>
   </w:style>
   <w:style w:type="table" w:default="1" w:styleId="TableNormal">
@@ -43268,7 +43266,7 @@
 </file>
 
 <file path=word/glossary/document.xml><?xml version="1.0" encoding="utf-8"?>
-<w:glossaryDocument xmlns:wpc="http://schemas.microsoft.com/office/word/2010/wordprocessingCanvas" xmlns:cx="http://schemas.microsoft.com/office/drawing/2014/chartex" xmlns:cx1="http://schemas.microsoft.com/office/drawing/2015/9/8/chartex" xmlns:cx2="http://schemas.microsoft.com/office/drawing/2015/10/21/chartex" xmlns:cx3="http://schemas.microsoft.com/office/drawing/2016/5/9/chartex" xmlns:cx4="http://schemas.microsoft.com/office/drawing/2016/5/10/chartex" xmlns:cx5="http://schemas.microsoft.com/office/drawing/2016/5/11/chartex" xmlns:cx6="http://schemas.microsoft.com/office/drawing/2016/5/12/chartex" xmlns:cx7="http://schemas.microsoft.com/office/drawing/2016/5/13/chartex" xmlns:cx8="http://schemas.microsoft.com/office/drawing/2016/5/14/chartex" xmlns:mc="http://schemas.openxmlformats.org/markup-compatibility/2006" xmlns:aink="http://schemas.microsoft.com/office/drawing/2016/ink" xmlns:am3d="http://schemas.microsoft.com/office/drawing/2017/model3d" xmlns:o="urn:schemas-microsoft-com:office:office" xmlns:oel="http://schemas.microsoft.com/office/2019/extlst" xmlns:r="http://schemas.openxmlformats.org/officeDocument/2006/relationships" xmlns:m="http://schemas.openxmlformats.org/officeDocument/2006/math" xmlns:v="urn:schemas-microsoft-com:vml" xmlns:wp14="http://schemas.microsoft.com/office/word/2010/wordprocessingDrawing" xmlns:wp="http://schemas.openxmlformats.org/drawingml/2006/wordprocessingDrawing" xmlns:w10="urn:schemas-microsoft-com:office:word" xmlns:w="http://schemas.openxmlformats.org/wordprocessingml/2006/main" xmlns:w14="http://schemas.microsoft.com/office/word/2010/wordml" xmlns:w15="http://schemas.microsoft.com/office/word/2012/wordml" xmlns:w16cex="http://schemas.microsoft.com/office/word/2018/wordml/cex" xmlns:w16cid="http://schemas.microsoft.com/office/word/2016/wordml/cid" xmlns:w16="http://schemas.microsoft.com/office/word/2018/wordml" xmlns:w16du="http://schemas.microsoft.com/office/word/2023/wordml/word16du" xmlns:w16sdtdh="http://schemas.microsoft.com/office/word/2020/wordml/sdtdatahash" xmlns:w16se="http://schemas.microsoft.com/office/word/2015/wordml/symex" xmlns:wpg="http://schemas.microsoft.com/office/word/2010/wordprocessingGroup" xmlns:wpi="http://schemas.microsoft.com/office/word/2010/wordprocessingInk" xmlns:wne="http://schemas.microsoft.com/office/word/2006/wordml" xmlns:wps="http://schemas.microsoft.com/office/word/2010/wordprocessingShape" mc:Ignorable="w14 w15 w16se w16cid w16 w16cex w16sdtdh w16du wp14">
+<w:glossaryDocument xmlns:wpc="http://schemas.microsoft.com/office/word/2010/wordprocessingCanvas" xmlns:cx="http://schemas.microsoft.com/office/drawing/2014/chartex" xmlns:cx1="http://schemas.microsoft.com/office/drawing/2015/9/8/chartex" xmlns:cx2="http://schemas.microsoft.com/office/drawing/2015/10/21/chartex" xmlns:cx3="http://schemas.microsoft.com/office/drawing/2016/5/9/chartex" xmlns:cx4="http://schemas.microsoft.com/office/drawing/2016/5/10/chartex" xmlns:cx5="http://schemas.microsoft.com/office/drawing/2016/5/11/chartex" xmlns:cx6="http://schemas.microsoft.com/office/drawing/2016/5/12/chartex" xmlns:cx7="http://schemas.microsoft.com/office/drawing/2016/5/13/chartex" xmlns:cx8="http://schemas.microsoft.com/office/drawing/2016/5/14/chartex" xmlns:mc="http://schemas.openxmlformats.org/markup-compatibility/2006" xmlns:aink="http://schemas.microsoft.com/office/drawing/2016/ink" xmlns:am3d="http://schemas.microsoft.com/office/drawing/2017/model3d" xmlns:o="urn:schemas-microsoft-com:office:office" xmlns:oel="http://schemas.microsoft.com/office/2019/extlst" xmlns:r="http://schemas.openxmlformats.org/officeDocument/2006/relationships" xmlns:m="http://schemas.openxmlformats.org/officeDocument/2006/math" xmlns:v="urn:schemas-microsoft-com:vml" xmlns:wp14="http://schemas.microsoft.com/office/word/2010/wordprocessingDrawing" xmlns:wp="http://schemas.openxmlformats.org/drawingml/2006/wordprocessingDrawing" xmlns:w10="urn:schemas-microsoft-com:office:word" xmlns:w="http://schemas.openxmlformats.org/wordprocessingml/2006/main" xmlns:w14="http://schemas.microsoft.com/office/word/2010/wordml" xmlns:w15="http://schemas.microsoft.com/office/word/2012/wordml" xmlns:w16cex="http://schemas.microsoft.com/office/word/2018/wordml/cex" xmlns:w16cid="http://schemas.microsoft.com/office/word/2016/wordml/cid" xmlns:w16="http://schemas.microsoft.com/office/word/2018/wordml" xmlns:w16du="http://schemas.microsoft.com/office/word/2023/wordml/word16du" xmlns:w16sdtdh="http://schemas.microsoft.com/office/word/2020/wordml/sdtdatahash" xmlns:w16sdtfl="http://schemas.microsoft.com/office/word/2024/wordml/sdtformatlock" xmlns:w16se="http://schemas.microsoft.com/office/word/2015/wordml/symex" xmlns:wpg="http://schemas.microsoft.com/office/word/2010/wordprocessingGroup" xmlns:wpi="http://schemas.microsoft.com/office/word/2010/wordprocessingInk" xmlns:wne="http://schemas.microsoft.com/office/word/2006/wordml" xmlns:wps="http://schemas.microsoft.com/office/word/2010/wordprocessingShape" mc:Ignorable="w14 w15 w16se w16cid w16 w16cex w16sdtdh w16sdtfl w16du wp14">
   <w:docParts>
     <w:docPart>
       <w:docPartPr>
@@ -43332,7 +43330,7 @@
 </file>
 
 <file path=word/glossary/fontTable.xml><?xml version="1.0" encoding="utf-8"?>
-<w:fonts xmlns:mc="http://schemas.openxmlformats.org/markup-compatibility/2006" xmlns:r="http://schemas.openxmlformats.org/officeDocument/2006/relationships" xmlns:w="http://schemas.openxmlformats.org/wordprocessingml/2006/main" xmlns:w14="http://schemas.microsoft.com/office/word/2010/wordml" xmlns:w15="http://schemas.microsoft.com/office/word/2012/wordml" xmlns:w16cex="http://schemas.microsoft.com/office/word/2018/wordml/cex" xmlns:w16cid="http://schemas.microsoft.com/office/word/2016/wordml/cid" xmlns:w16="http://schemas.microsoft.com/office/word/2018/wordml" xmlns:w16du="http://schemas.microsoft.com/office/word/2023/wordml/word16du" xmlns:w16sdtdh="http://schemas.microsoft.com/office/word/2020/wordml/sdtdatahash" xmlns:w16se="http://schemas.microsoft.com/office/word/2015/wordml/symex" mc:Ignorable="w14 w15 w16se w16cid w16 w16cex w16sdtdh w16du">
+<w:fonts xmlns:mc="http://schemas.openxmlformats.org/markup-compatibility/2006" xmlns:r="http://schemas.openxmlformats.org/officeDocument/2006/relationships" xmlns:w="http://schemas.openxmlformats.org/wordprocessingml/2006/main" xmlns:w14="http://schemas.microsoft.com/office/word/2010/wordml" xmlns:w15="http://schemas.microsoft.com/office/word/2012/wordml" xmlns:w16cex="http://schemas.microsoft.com/office/word/2018/wordml/cex" xmlns:w16cid="http://schemas.microsoft.com/office/word/2016/wordml/cid" xmlns:w16="http://schemas.microsoft.com/office/word/2018/wordml" xmlns:w16du="http://schemas.microsoft.com/office/word/2023/wordml/word16du" xmlns:w16sdtdh="http://schemas.microsoft.com/office/word/2020/wordml/sdtdatahash" xmlns:w16sdtfl="http://schemas.microsoft.com/office/word/2024/wordml/sdtformatlock" xmlns:w16se="http://schemas.microsoft.com/office/word/2015/wordml/symex" mc:Ignorable="w14 w15 w16se w16cid w16 w16cex w16sdtdh w16sdtfl w16du">
   <w:font w:name="Times New Roman">
     <w:panose1 w:val="02020603050405020304"/>
     <w:charset w:val="00"/>
@@ -43343,7 +43341,7 @@
   <w:font w:name="Symbol">
     <w:panose1 w:val="05050102010706020507"/>
     <w:charset w:val="02"/>
-    <w:family w:val="roman"/>
+    <w:family w:val="decorative"/>
     <w:pitch w:val="variable"/>
     <w:sig w:usb0="00000000" w:usb1="10000000" w:usb2="00000000" w:usb3="00000000" w:csb0="80000000" w:csb1="00000000"/>
   </w:font>
@@ -43356,12 +43354,14 @@
   </w:font>
   <w:font w:name="Wingdings">
     <w:panose1 w:val="05000000000000000000"/>
-    <w:charset w:val="02"/>
-    <w:family w:val="auto"/>
+    <w:charset w:val="4D"/>
+    <w:family w:val="decorative"/>
     <w:pitch w:val="variable"/>
-    <w:sig w:usb0="00000000" w:usb1="10000000" w:usb2="00000000" w:usb3="00000000" w:csb0="80000000" w:csb1="00000000"/>
+    <w:sig w:usb0="00000003" w:usb1="00000000" w:usb2="00000000" w:usb3="00000000" w:csb0="80000001" w:csb1="00000000"/>
   </w:font>
   <w:font w:name="Yu Mincho">
+    <w:altName w:val="游明朝"/>
+    <w:panose1 w:val="02020400000000000000"/>
     <w:charset w:val="80"/>
     <w:family w:val="roman"/>
     <w:pitch w:val="variable"/>
@@ -43389,6 +43389,7 @@
     <w:sig w:usb0="E4002EFF" w:usb1="C000247B" w:usb2="00000009" w:usb3="00000000" w:csb0="000001FF" w:csb1="00000000"/>
   </w:font>
   <w:font w:name="Yu Gothic Light">
+    <w:altName w:val="游ゴシック Light"/>
     <w:panose1 w:val="020B0300000000000000"/>
     <w:charset w:val="80"/>
     <w:family w:val="swiss"/>
@@ -43412,11 +43413,11 @@
   </w:font>
   <w:font w:name="Times New Roman Bold">
     <w:altName w:val="Malgun Gothic Semilight"/>
-    <w:panose1 w:val="00000000000000000000"/>
+    <w:panose1 w:val="020B0604020202020204"/>
     <w:charset w:val="00"/>
     <w:family w:val="roman"/>
     <w:notTrueType/>
-    <w:pitch w:val="variable"/>
+    <w:pitch w:val="default"/>
     <w:sig w:usb0="00000003" w:usb1="00000000" w:usb2="00000000" w:usb3="00000000" w:csb0="00000001" w:csb1="00000000"/>
   </w:font>
   <w:font w:name="Cordia New">
@@ -43456,7 +43457,6 @@
     <w:sig w:usb0="00000287" w:usb1="00000000" w:usb2="00000000" w:usb3="00000000" w:csb0="0000009F" w:csb1="00000000"/>
   </w:font>
   <w:font w:name="Arial Narrow">
-    <w:altName w:val="Arial"/>
     <w:panose1 w:val="020B0606020202030204"/>
     <w:charset w:val="00"/>
     <w:family w:val="swiss"/>
@@ -43464,12 +43464,14 @@
     <w:sig w:usb0="00000287" w:usb1="00000800" w:usb2="00000000" w:usb3="00000000" w:csb0="0000009F" w:csb1="00000000"/>
   </w:font>
   <w:font w:name="Aptos">
+    <w:panose1 w:val="020B0004020202020204"/>
     <w:charset w:val="00"/>
     <w:family w:val="swiss"/>
     <w:pitch w:val="variable"/>
     <w:sig w:usb0="20000287" w:usb1="00000003" w:usb2="00000000" w:usb3="00000000" w:csb0="0000019F" w:csb1="00000000"/>
   </w:font>
   <w:font w:name="Aptos Display">
+    <w:panose1 w:val="020B0004020202020204"/>
     <w:charset w:val="00"/>
     <w:family w:val="swiss"/>
     <w:pitch w:val="variable"/>
@@ -43479,7 +43481,8 @@
 </file>
 
 <file path=word/glossary/settings.xml><?xml version="1.0" encoding="utf-8"?>
-<w:settings xmlns:mc="http://schemas.openxmlformats.org/markup-compatibility/2006" xmlns:o="urn:schemas-microsoft-com:office:office" xmlns:r="http://schemas.openxmlformats.org/officeDocument/2006/relationships" xmlns:m="http://schemas.openxmlformats.org/officeDocument/2006/math" xmlns:v="urn:schemas-microsoft-com:vml" xmlns:w10="urn:schemas-microsoft-com:office:word" xmlns:w="http://schemas.openxmlformats.org/wordprocessingml/2006/main" xmlns:w14="http://schemas.microsoft.com/office/word/2010/wordml" xmlns:w15="http://schemas.microsoft.com/office/word/2012/wordml" xmlns:w16cex="http://schemas.microsoft.com/office/word/2018/wordml/cex" xmlns:w16cid="http://schemas.microsoft.com/office/word/2016/wordml/cid" xmlns:w16="http://schemas.microsoft.com/office/word/2018/wordml" xmlns:w16du="http://schemas.microsoft.com/office/word/2023/wordml/word16du" xmlns:w16sdtdh="http://schemas.microsoft.com/office/word/2020/wordml/sdtdatahash" xmlns:w16se="http://schemas.microsoft.com/office/word/2015/wordml/symex" xmlns:sl="http://schemas.openxmlformats.org/schemaLibrary/2006/main" mc:Ignorable="w14 w15 w16se w16cid w16 w16cex w16sdtdh w16du">
+<w:settings xmlns:mc="http://schemas.openxmlformats.org/markup-compatibility/2006" xmlns:o="urn:schemas-microsoft-com:office:office" xmlns:r="http://schemas.openxmlformats.org/officeDocument/2006/relationships" xmlns:m="http://schemas.openxmlformats.org/officeDocument/2006/math" xmlns:v="urn:schemas-microsoft-com:vml" xmlns:w10="urn:schemas-microsoft-com:office:word" xmlns:w="http://schemas.openxmlformats.org/wordprocessingml/2006/main" xmlns:w14="http://schemas.microsoft.com/office/word/2010/wordml" xmlns:w15="http://schemas.microsoft.com/office/word/2012/wordml" xmlns:w16cex="http://schemas.microsoft.com/office/word/2018/wordml/cex" xmlns:w16cid="http://schemas.microsoft.com/office/word/2016/wordml/cid" xmlns:w16="http://schemas.microsoft.com/office/word/2018/wordml" xmlns:w16du="http://schemas.microsoft.com/office/word/2023/wordml/word16du" xmlns:w16sdtdh="http://schemas.microsoft.com/office/word/2020/wordml/sdtdatahash" xmlns:w16sdtfl="http://schemas.microsoft.com/office/word/2024/wordml/sdtformatlock" xmlns:w16se="http://schemas.microsoft.com/office/word/2015/wordml/symex" xmlns:sl="http://schemas.openxmlformats.org/schemaLibrary/2006/main" mc:Ignorable="w14 w15 w16se w16cid w16 w16cex w16sdtdh w16sdtfl w16du">
+  <w:revisionView w:inkAnnotations="0"/>
   <w:defaultTabStop w:val="720"/>
   <w:hyphenationZone w:val="425"/>
   <w:characterSpacingControl w:val="doNotCompress"/>
@@ -43504,6 +43507,7 @@
     <w:rsid w:val="00233396"/>
     <w:rsid w:val="00255BB2"/>
     <w:rsid w:val="00384BC6"/>
+    <w:rsid w:val="00440F66"/>
     <w:rsid w:val="00455134"/>
     <w:rsid w:val="004F7475"/>
     <w:rsid w:val="00500DA8"/>
@@ -43537,6 +43541,7 @@
     <w:rsid w:val="00BF3A4A"/>
     <w:rsid w:val="00BF5A90"/>
     <w:rsid w:val="00C10C86"/>
+    <w:rsid w:val="00C30170"/>
     <w:rsid w:val="00D2152C"/>
     <w:rsid w:val="00D45EA7"/>
     <w:rsid w:val="00D8503C"/>
@@ -43565,14 +43570,14 @@
   </m:mathPr>
   <w:themeFontLang w:val="en-US" w:eastAsia="ja-JP" w:bidi="ar-SA"/>
   <w:clrSchemeMapping w:bg1="light1" w:t1="dark1" w:bg2="light2" w:t2="dark2" w:accent1="accent1" w:accent2="accent2" w:accent3="accent3" w:accent4="accent4" w:accent5="accent5" w:accent6="accent6" w:hyperlink="hyperlink" w:followedHyperlink="followedHyperlink"/>
-  <w:decimalSymbol w:val="."/>
+  <w:decimalSymbol w:val=","/>
   <w:listSeparator w:val=","/>
   <w14:docId w14:val="3E064A67"/>
 </w:settings>
 </file>
 
 <file path=word/glossary/styles.xml><?xml version="1.0" encoding="utf-8"?>
-<w:styles xmlns:mc="http://schemas.openxmlformats.org/markup-compatibility/2006" xmlns:r="http://schemas.openxmlformats.org/officeDocument/2006/relationships" xmlns:w="http://schemas.openxmlformats.org/wordprocessingml/2006/main" xmlns:w14="http://schemas.microsoft.com/office/word/2010/wordml" xmlns:w15="http://schemas.microsoft.com/office/word/2012/wordml" xmlns:w16cex="http://schemas.microsoft.com/office/word/2018/wordml/cex" xmlns:w16cid="http://schemas.microsoft.com/office/word/2016/wordml/cid" xmlns:w16="http://schemas.microsoft.com/office/word/2018/wordml" xmlns:w16du="http://schemas.microsoft.com/office/word/2023/wordml/word16du" xmlns:w16sdtdh="http://schemas.microsoft.com/office/word/2020/wordml/sdtdatahash" xmlns:w16se="http://schemas.microsoft.com/office/word/2015/wordml/symex" mc:Ignorable="w14 w15 w16se w16cid w16 w16cex w16sdtdh w16du">
+<w:styles xmlns:mc="http://schemas.openxmlformats.org/markup-compatibility/2006" xmlns:r="http://schemas.openxmlformats.org/officeDocument/2006/relationships" xmlns:w="http://schemas.openxmlformats.org/wordprocessingml/2006/main" xmlns:w14="http://schemas.microsoft.com/office/word/2010/wordml" xmlns:w15="http://schemas.microsoft.com/office/word/2012/wordml" xmlns:w16cex="http://schemas.microsoft.com/office/word/2018/wordml/cex" xmlns:w16cid="http://schemas.microsoft.com/office/word/2016/wordml/cid" xmlns:w16="http://schemas.microsoft.com/office/word/2018/wordml" xmlns:w16du="http://schemas.microsoft.com/office/word/2023/wordml/word16du" xmlns:w16sdtdh="http://schemas.microsoft.com/office/word/2020/wordml/sdtdatahash" xmlns:w16sdtfl="http://schemas.microsoft.com/office/word/2024/wordml/sdtformatlock" xmlns:w16se="http://schemas.microsoft.com/office/word/2015/wordml/symex" mc:Ignorable="w14 w15 w16se w16cid w16 w16cex w16sdtdh w16sdtfl w16du">
   <w:docDefaults>
     <w:rPrDefault>
       <w:rPr>
@@ -44001,7 +44006,7 @@
 </file>
 
 <file path=word/glossary/webSettings.xml><?xml version="1.0" encoding="utf-8"?>
-<w:webSettings xmlns:mc="http://schemas.openxmlformats.org/markup-compatibility/2006" xmlns:r="http://schemas.openxmlformats.org/officeDocument/2006/relationships" xmlns:w="http://schemas.openxmlformats.org/wordprocessingml/2006/main" xmlns:w14="http://schemas.microsoft.com/office/word/2010/wordml" xmlns:w15="http://schemas.microsoft.com/office/word/2012/wordml" xmlns:w16cex="http://schemas.microsoft.com/office/word/2018/wordml/cex" xmlns:w16cid="http://schemas.microsoft.com/office/word/2016/wordml/cid" xmlns:w16="http://schemas.microsoft.com/office/word/2018/wordml" xmlns:w16du="http://schemas.microsoft.com/office/word/2023/wordml/word16du" xmlns:w16sdtdh="http://schemas.microsoft.com/office/word/2020/wordml/sdtdatahash" xmlns:w16se="http://schemas.microsoft.com/office/word/2015/wordml/symex" mc:Ignorable="w14 w15 w16se w16cid w16 w16cex w16sdtdh w16du"/>
+<w:webSettings xmlns:mc="http://schemas.openxmlformats.org/markup-compatibility/2006" xmlns:r="http://schemas.openxmlformats.org/officeDocument/2006/relationships" xmlns:w="http://schemas.openxmlformats.org/wordprocessingml/2006/main" xmlns:w14="http://schemas.microsoft.com/office/word/2010/wordml" xmlns:w15="http://schemas.microsoft.com/office/word/2012/wordml" xmlns:w16cex="http://schemas.microsoft.com/office/word/2018/wordml/cex" xmlns:w16cid="http://schemas.microsoft.com/office/word/2016/wordml/cid" xmlns:w16="http://schemas.microsoft.com/office/word/2018/wordml" xmlns:w16du="http://schemas.microsoft.com/office/word/2023/wordml/word16du" xmlns:w16sdtdh="http://schemas.microsoft.com/office/word/2020/wordml/sdtdatahash" xmlns:w16sdtfl="http://schemas.microsoft.com/office/word/2024/wordml/sdtformatlock" xmlns:w16se="http://schemas.microsoft.com/office/word/2015/wordml/symex" mc:Ignorable="w14 w15 w16se w16cid w16 w16cex w16sdtdh w16sdtfl w16du"/>
 </file>
 
 <file path=word/theme/theme1.xml><?xml version="1.0" encoding="utf-8"?>
@@ -44266,30 +44271,6 @@
 </file>
 
 <file path=customXml/item1.xml><?xml version="1.0" encoding="utf-8"?>
-<p:properties xmlns:p="http://schemas.microsoft.com/office/2006/metadata/properties" xmlns:xsi="http://www.w3.org/2001/XMLSchema-instance" xmlns:pc="http://schemas.microsoft.com/office/infopath/2007/PartnerControls">
-  <documentManagement>
-    <TaxCatchAll xmlns="50b1dd69-4c56-4a1c-b3ce-7cd2bac560be" xsi:nil="true"/>
-    <lcf76f155ced4ddcb4097134ff3c332f xmlns="433138c1-cfdf-4f6b-89e8-511447de8f15">
-      <Terms xmlns="http://schemas.microsoft.com/office/infopath/2007/PartnerControls"/>
-    </lcf76f155ced4ddcb4097134ff3c332f>
-  </documentManagement>
-</p:properties>
-</file>
-
-<file path=customXml/item2.xml><?xml version="1.0" encoding="utf-8"?>
-<?mso-contentType ?>
-<FormTemplates xmlns="http://schemas.microsoft.com/sharepoint/v3/contenttype/forms">
-  <Display>DocumentLibraryForm</Display>
-  <Edit>DocumentLibraryForm</Edit>
-  <New>DocumentLibraryForm</New>
-</FormTemplates>
-</file>
-
-<file path=customXml/item3.xml><?xml version="1.0" encoding="utf-8"?>
-<b:Sources xmlns:b="http://schemas.openxmlformats.org/officeDocument/2006/bibliography" xmlns="http://schemas.openxmlformats.org/officeDocument/2006/bibliography" SelectedStyle="\APASixthEditionOfficeOnline.xsl" StyleName="APA" Version="6"/>
-</file>
-
-<file path=customXml/item4.xml><?xml version="1.0" encoding="utf-8"?>
 <ct:contentTypeSchema xmlns:ct="http://schemas.microsoft.com/office/2006/metadata/contentType" xmlns:ma="http://schemas.microsoft.com/office/2006/metadata/properties/metaAttributes" ct:_="" ma:_="" ma:contentTypeName="Document" ma:contentTypeID="0x01010062D9CD9ACC6AE244981CDEFACE8F40CE" ma:contentTypeVersion="14" ma:contentTypeDescription="Create a new document." ma:contentTypeScope="" ma:versionID="5588035a854d9997c1d7df24985cfe90">
   <xsd:schema xmlns:xsd="http://www.w3.org/2001/XMLSchema" xmlns:xs="http://www.w3.org/2001/XMLSchema" xmlns:p="http://schemas.microsoft.com/office/2006/metadata/properties" xmlns:ns2="433138c1-cfdf-4f6b-89e8-511447de8f15" xmlns:ns3="50b1dd69-4c56-4a1c-b3ce-7cd2bac560be" targetNamespace="http://schemas.microsoft.com/office/2006/metadata/properties" ma:root="true" ma:fieldsID="08b0b5a8a4dc2a6a7064cc49017e9875" ns2:_="" ns3:_="">
     <xsd:import namespace="433138c1-cfdf-4f6b-89e8-511447de8f15"/>
@@ -44518,34 +44499,31 @@
 </ct:contentTypeSchema>
 </file>
 
-<file path=customXml/itemProps1.xml><?xml version="1.0" encoding="utf-8"?>
-<ds:datastoreItem xmlns:ds="http://schemas.openxmlformats.org/officeDocument/2006/customXml" ds:itemID="{F27ED617-3E41-4CDE-ADF1-26908813BD40}">
-  <ds:schemaRefs>
-    <ds:schemaRef ds:uri="http://schemas.microsoft.com/office/2006/metadata/properties"/>
-    <ds:schemaRef ds:uri="http://schemas.microsoft.com/office/infopath/2007/PartnerControls"/>
-    <ds:schemaRef ds:uri="50b1dd69-4c56-4a1c-b3ce-7cd2bac560be"/>
-    <ds:schemaRef ds:uri="433138c1-cfdf-4f6b-89e8-511447de8f15"/>
-  </ds:schemaRefs>
-</ds:datastoreItem>
+<file path=customXml/item2.xml><?xml version="1.0" encoding="utf-8"?>
+<b:Sources xmlns:b="http://schemas.openxmlformats.org/officeDocument/2006/bibliography" xmlns="http://schemas.openxmlformats.org/officeDocument/2006/bibliography" SelectedStyle="\APASixthEditionOfficeOnline.xsl" StyleName="APA" Version="6"/>
 </file>
 
-<file path=customXml/itemProps2.xml><?xml version="1.0" encoding="utf-8"?>
-<ds:datastoreItem xmlns:ds="http://schemas.openxmlformats.org/officeDocument/2006/customXml" ds:itemID="{660F5C07-1FE4-4E43-9048-BA68F3D17B3B}">
-  <ds:schemaRefs>
-    <ds:schemaRef ds:uri="http://schemas.microsoft.com/sharepoint/v3/contenttype/forms"/>
-  </ds:schemaRefs>
-</ds:datastoreItem>
+<file path=customXml/item3.xml><?xml version="1.0" encoding="utf-8"?>
+<?mso-contentType ?>
+<FormTemplates xmlns="http://schemas.microsoft.com/sharepoint/v3/contenttype/forms">
+  <Display>DocumentLibraryForm</Display>
+  <Edit>DocumentLibraryForm</Edit>
+  <New>DocumentLibraryForm</New>
+</FormTemplates>
 </file>
 
-<file path=customXml/itemProps3.xml><?xml version="1.0" encoding="utf-8"?>
-<ds:datastoreItem xmlns:ds="http://schemas.openxmlformats.org/officeDocument/2006/customXml" ds:itemID="{77BFD2E0-256E-4705-AA66-213574F7F298}">
-  <ds:schemaRefs>
-    <ds:schemaRef ds:uri="http://schemas.openxmlformats.org/officeDocument/2006/bibliography"/>
-  </ds:schemaRefs>
-</ds:datastoreItem>
+<file path=customXml/item4.xml><?xml version="1.0" encoding="utf-8"?>
+<p:properties xmlns:p="http://schemas.microsoft.com/office/2006/metadata/properties" xmlns:xsi="http://www.w3.org/2001/XMLSchema-instance" xmlns:pc="http://schemas.microsoft.com/office/infopath/2007/PartnerControls">
+  <documentManagement>
+    <TaxCatchAll xmlns="50b1dd69-4c56-4a1c-b3ce-7cd2bac560be" xsi:nil="true"/>
+    <lcf76f155ced4ddcb4097134ff3c332f xmlns="433138c1-cfdf-4f6b-89e8-511447de8f15">
+      <Terms xmlns="http://schemas.microsoft.com/office/infopath/2007/PartnerControls"/>
+    </lcf76f155ced4ddcb4097134ff3c332f>
+  </documentManagement>
+</p:properties>
 </file>
 
-<file path=customXml/itemProps4.xml><?xml version="1.0" encoding="utf-8"?>
+<file path=customXml/itemProps1.xml><?xml version="1.0" encoding="utf-8"?>
 <ds:datastoreItem xmlns:ds="http://schemas.openxmlformats.org/officeDocument/2006/customXml" ds:itemID="{5393F39E-65C6-40E0-A2C5-3C230F2AF9A8}">
   <ds:schemaRefs>
     <ds:schemaRef ds:uri="http://schemas.microsoft.com/office/2006/metadata/contentType"/>
@@ -44562,4 +44540,31 @@
     <ds:schemaRef ds:uri="http://schemas.microsoft.com/internal/obd"/>
   </ds:schemaRefs>
 </ds:datastoreItem>
+</file>
+
+<file path=customXml/itemProps2.xml><?xml version="1.0" encoding="utf-8"?>
+<ds:datastoreItem xmlns:ds="http://schemas.openxmlformats.org/officeDocument/2006/customXml" ds:itemID="{77BFD2E0-256E-4705-AA66-213574F7F298}">
+  <ds:schemaRefs>
+    <ds:schemaRef ds:uri="http://schemas.openxmlformats.org/officeDocument/2006/bibliography"/>
+  </ds:schemaRefs>
+</ds:datastoreItem>
+</file>
+
+<file path=customXml/itemProps3.xml><?xml version="1.0" encoding="utf-8"?>
+<ds:datastoreItem xmlns:ds="http://schemas.openxmlformats.org/officeDocument/2006/customXml" ds:itemID="{660F5C07-1FE4-4E43-9048-BA68F3D17B3B}">
+  <ds:schemaRefs>
+    <ds:schemaRef ds:uri="http://schemas.microsoft.com/sharepoint/v3/contenttype/forms"/>
+  </ds:schemaRefs>
+</ds:datastoreItem>
+</file>
+
+<file path=customXml/itemProps4.xml><?xml version="1.0" encoding="utf-8"?>
+<ds:datastoreItem xmlns:ds="http://schemas.openxmlformats.org/officeDocument/2006/customXml" ds:itemID="{F27ED617-3E41-4CDE-ADF1-26908813BD40}">
+  <ds:schemaRefs>
+    <ds:schemaRef ds:uri="http://schemas.microsoft.com/office/2006/metadata/properties"/>
+    <ds:schemaRef ds:uri="http://schemas.microsoft.com/office/infopath/2007/PartnerControls"/>
+    <ds:schemaRef ds:uri="50b1dd69-4c56-4a1c-b3ce-7cd2bac560be"/>
+    <ds:schemaRef ds:uri="433138c1-cfdf-4f6b-89e8-511447de8f15"/>
+  </ds:schemaRefs>
+</ds:datastoreItem>
 </file>
</xml_diff>